<commit_message>
fix(01-01): regenerate reference_base.docx with course styles and sample text per style
</commit_message>
<xml_diff>
--- a/templates/reference_base.docx
+++ b/templates/reference_base.docx
@@ -1,15 +1,312 @@
 
 <file path=word/document.xml><?xml version="1.0" encoding="utf-8"?>
-<w:document xmlns:mc="http://schemas.openxmlformats.org/markup-compatibility/2006" xmlns:o="urn:schemas-microsoft-com:office:office" xmlns:r="http://schemas.openxmlformats.org/officeDocument/2006/relationships" xmlns:m="http://schemas.openxmlformats.org/officeDocument/2006/math" xmlns:v="urn:schemas-microsoft-com:vml" xmlns:wp="http://schemas.openxmlformats.org/drawingml/2006/wordprocessingDrawing" xmlns:w10="urn:schemas-microsoft-com:office:word" xmlns:w="http://schemas.openxmlformats.org/wordprocessingml/2006/main" xmlns:wne="http://schemas.microsoft.com/office/word/2006/wordml" xmlns:sl="http://schemas.openxmlformats.org/schemaLibrary/2006/main" xmlns:a="http://schemas.openxmlformats.org/drawingml/2006/main" xmlns:pic="http://schemas.openxmlformats.org/drawingml/2006/picture" xmlns:c="http://schemas.openxmlformats.org/drawingml/2006/chart" xmlns:lc="http://schemas.openxmlformats.org/drawingml/2006/lockedCanvas" xmlns:dgm="http://schemas.openxmlformats.org/drawingml/2006/diagram" xmlns:wps="http://schemas.microsoft.com/office/word/2010/wordprocessingShape" xmlns:wpg="http://schemas.microsoft.com/office/word/2010/wordprocessingGroup" xmlns:w14="http://schemas.microsoft.com/office/word/2010/wordml" xmlns:w15="http://schemas.microsoft.com/office/word/2012/wordml" xmlns:w16="http://schemas.microsoft.com/office/word/2018/wordml" xmlns:w16cex="http://schemas.microsoft.com/office/word/2018/wordml/cex" xmlns:w16cid="http://schemas.microsoft.com/office/word/2016/wordml/cid" xmlns="http://schemas.microsoft.com/office/tasks/2019/documenttasks" xmlns:cr="http://schemas.microsoft.com/office/comments/2020/reactions">
+<w:document xmlns:w="http://schemas.openxmlformats.org/wordprocessingml/2006/main" xmlns:m="http://schemas.openxmlformats.org/officeDocument/2006/math" xmlns:r="http://schemas.openxmlformats.org/officeDocument/2006/relationships" xmlns:o="urn:schemas-microsoft-com:office:office" xmlns:v="urn:schemas-microsoft-com:vml" xmlns:w10="urn:schemas-microsoft-com:office:word" xmlns:a="http://schemas.openxmlformats.org/drawingml/2006/main" xmlns:pic="http://schemas.openxmlformats.org/drawingml/2006/picture" xmlns:wp="http://schemas.openxmlformats.org/drawingml/2006/wordprocessingDrawing">
   <w:body>
+    <w:bookmarkStart w:id="23" w:name="heading-1"/>
+    <w:p>
+      <w:pPr>
+        <w:pStyle w:val="Heading1"/>
+      </w:pPr>
+      <w:r>
+        <w:t xml:space="preserve">Heading 1</w:t>
+      </w:r>
+    </w:p>
+    <w:bookmarkStart w:id="22" w:name="heading-2"/>
+    <w:p>
+      <w:pPr>
+        <w:pStyle w:val="Heading2"/>
+      </w:pPr>
+      <w:r>
+        <w:t xml:space="preserve">Heading 2</w:t>
+      </w:r>
+    </w:p>
+    <w:bookmarkStart w:id="21" w:name="heading-3"/>
+    <w:p>
+      <w:pPr>
+        <w:pStyle w:val="Heading3"/>
+      </w:pPr>
+      <w:r>
+        <w:t xml:space="preserve">Heading 3</w:t>
+      </w:r>
+    </w:p>
+    <w:bookmarkStart w:id="20" w:name="heading-4"/>
+    <w:p>
+      <w:pPr>
+        <w:pStyle w:val="Heading4"/>
+      </w:pPr>
+      <w:r>
+        <w:t xml:space="preserve">Heading 4</w:t>
+      </w:r>
+    </w:p>
+    <w:p>
+      <w:pPr>
+        <w:pStyle w:val="FirstParagraph"/>
+      </w:pPr>
+      <w:r>
+        <w:t xml:space="preserve">Normal paragraph text. This is how body text appears in the document. Lorem ipsum dolor sit amet, consectetur adipiscing elit.</w:t>
+      </w:r>
+    </w:p>
+    <w:p>
+      <w:pPr>
+        <w:pStyle w:val="BodyText"/>
+      </w:pPr>
+      <w:r>
+        <w:rPr>
+          <w:b/>
+          <w:bCs/>
+        </w:rPr>
+        <w:t xml:space="preserve">Bold text</w:t>
+      </w:r>
+      <w:r>
+        <w:t xml:space="preserve"> </w:t>
+      </w:r>
+      <w:r>
+        <w:t xml:space="preserve">and</w:t>
+      </w:r>
+      <w:r>
+        <w:t xml:space="preserve"> </w:t>
+      </w:r>
+      <w:r>
+        <w:rPr>
+          <w:i/>
+          <w:iCs/>
+        </w:rPr>
+        <w:t xml:space="preserve">italic text</w:t>
+      </w:r>
+      <w:r>
+        <w:t xml:space="preserve"> </w:t>
+      </w:r>
+      <w:r>
+        <w:t xml:space="preserve">inline.</w:t>
+      </w:r>
+    </w:p>
+    <w:tbl>
+      <w:tblPr>
+        <w:tblStyle w:val="Table"/>
+        <w:tblW w:type="auto" w:w="0"/>
+        <w:tblLook w:firstRow="1" w:lastRow="0" w:firstColumn="0" w:lastColumn="0" w:noHBand="0" w:noVBand="0" w:val="0020"/>
+      </w:tblPr>
+      <w:tblGrid>
+        <w:gridCol w:w="2640"/>
+        <w:gridCol w:w="2640"/>
+        <w:gridCol w:w="2640"/>
+      </w:tblGrid>
+      <w:tr>
+        <w:trPr>
+          <w:tblHeader w:val="on"/>
+        </w:trPr>
+        <w:tc>
+          <w:tcPr/>
+          <w:p>
+            <w:pPr>
+              <w:pStyle w:val="Compact"/>
+            </w:pPr>
+            <w:r>
+              <w:t xml:space="preserve">Column A</w:t>
+            </w:r>
+          </w:p>
+        </w:tc>
+        <w:tc>
+          <w:tcPr/>
+          <w:p>
+            <w:pPr>
+              <w:pStyle w:val="Compact"/>
+            </w:pPr>
+            <w:r>
+              <w:t xml:space="preserve">Column B</w:t>
+            </w:r>
+          </w:p>
+        </w:tc>
+        <w:tc>
+          <w:tcPr/>
+          <w:p>
+            <w:pPr>
+              <w:pStyle w:val="Compact"/>
+            </w:pPr>
+            <w:r>
+              <w:t xml:space="preserve">Column C</w:t>
+            </w:r>
+          </w:p>
+        </w:tc>
+      </w:tr>
+      <w:tr>
+        <w:tc>
+          <w:tcPr/>
+          <w:p>
+            <w:pPr>
+              <w:pStyle w:val="Compact"/>
+            </w:pPr>
+            <w:r>
+              <w:t xml:space="preserve">Value 1</w:t>
+            </w:r>
+          </w:p>
+        </w:tc>
+        <w:tc>
+          <w:tcPr/>
+          <w:p>
+            <w:pPr>
+              <w:pStyle w:val="Compact"/>
+            </w:pPr>
+            <w:r>
+              <w:t xml:space="preserve">Value 2</w:t>
+            </w:r>
+          </w:p>
+        </w:tc>
+        <w:tc>
+          <w:tcPr/>
+          <w:p>
+            <w:pPr>
+              <w:pStyle w:val="Compact"/>
+            </w:pPr>
+            <w:r>
+              <w:t xml:space="preserve">Value 3</w:t>
+            </w:r>
+          </w:p>
+        </w:tc>
+      </w:tr>
+      <w:tr>
+        <w:tc>
+          <w:tcPr/>
+          <w:p>
+            <w:pPr>
+              <w:pStyle w:val="Compact"/>
+            </w:pPr>
+            <w:r>
+              <w:t xml:space="preserve">Value 4</w:t>
+            </w:r>
+          </w:p>
+        </w:tc>
+        <w:tc>
+          <w:tcPr/>
+          <w:p>
+            <w:pPr>
+              <w:pStyle w:val="Compact"/>
+            </w:pPr>
+            <w:r>
+              <w:t xml:space="preserve">Value 5</w:t>
+            </w:r>
+          </w:p>
+        </w:tc>
+        <w:tc>
+          <w:tcPr/>
+          <w:p>
+            <w:pPr>
+              <w:pStyle w:val="Compact"/>
+            </w:pPr>
+            <w:r>
+              <w:t xml:space="preserve">Value 6</w:t>
+            </w:r>
+          </w:p>
+        </w:tc>
+      </w:tr>
+    </w:tbl>
+    <w:p>
+      <w:pPr>
+        <w:pStyle w:val="Compact"/>
+        <w:numPr>
+          <w:ilvl w:val="0"/>
+          <w:numId w:val="1001"/>
+        </w:numPr>
+      </w:pPr>
+      <w:r>
+        <w:t xml:space="preserve">Bullet item one</w:t>
+      </w:r>
+    </w:p>
+    <w:p>
+      <w:pPr>
+        <w:pStyle w:val="Compact"/>
+        <w:numPr>
+          <w:ilvl w:val="0"/>
+          <w:numId w:val="1001"/>
+        </w:numPr>
+      </w:pPr>
+      <w:r>
+        <w:t xml:space="preserve">Bullet item two</w:t>
+      </w:r>
+    </w:p>
+    <w:p>
+      <w:pPr>
+        <w:pStyle w:val="Compact"/>
+        <w:numPr>
+          <w:ilvl w:val="0"/>
+          <w:numId w:val="1001"/>
+        </w:numPr>
+      </w:pPr>
+      <w:r>
+        <w:t xml:space="preserve">Bullet item three</w:t>
+      </w:r>
+    </w:p>
+    <w:p>
+      <w:pPr>
+        <w:pStyle w:val="Compact"/>
+        <w:numPr>
+          <w:ilvl w:val="0"/>
+          <w:numId w:val="1002"/>
+        </w:numPr>
+      </w:pPr>
+      <w:r>
+        <w:t xml:space="preserve">Numbered item one</w:t>
+      </w:r>
+    </w:p>
+    <w:p>
+      <w:pPr>
+        <w:pStyle w:val="Compact"/>
+        <w:numPr>
+          <w:ilvl w:val="0"/>
+          <w:numId w:val="1002"/>
+        </w:numPr>
+      </w:pPr>
+      <w:r>
+        <w:t xml:space="preserve">Numbered item two</w:t>
+      </w:r>
+    </w:p>
+    <w:p>
+      <w:pPr>
+        <w:pStyle w:val="Compact"/>
+        <w:numPr>
+          <w:ilvl w:val="0"/>
+          <w:numId w:val="1002"/>
+        </w:numPr>
+      </w:pPr>
+      <w:r>
+        <w:t xml:space="preserve">Numbered item three</w:t>
+      </w:r>
+    </w:p>
+    <w:bookmarkEnd w:id="20"/>
+    <w:bookmarkEnd w:id="21"/>
+    <w:bookmarkEnd w:id="22"/>
+    <w:bookmarkEnd w:id="23"/>
     <w:sectPr>
-      <w:headerReference r:id="rId19" w:type="default"/>
-      <w:pgSz w:h="16834" w:w="11909" w:orient="portrait"/>
-      <w:pgMar w:bottom="1440.0000000000002" w:top="1440.0000000000002" w:left="1440.0000000000002" w:right="1440.0000000000002" w:header="720" w:footer="720"/>
+      <w:headerReference r:id="rId9" w:type="default"/>
+      <w:pgSz w:h="16834" w:orient="portrait" w:w="11909"/>
+      <w:pgMar w:bottom="1440.0000000000002" w:footer="720" w:header="720" w:left="1440.0000000000002" w:right="1440.0000000000002" w:top="1440.0000000000002"/>
       <w:pgNumType w:start="1"/>
     </w:sectPr>
   </w:body>
 </w:document>
+</file>
+
+<file path=word/comments.xml><?xml version="1.0" encoding="utf-8"?>
+<w:comments xmlns:w="http://schemas.openxmlformats.org/wordprocessingml/2006/main" xmlns:m="http://schemas.openxmlformats.org/officeDocument/2006/math" xmlns:r="http://schemas.openxmlformats.org/officeDocument/2006/relationships" xmlns:o="urn:schemas-microsoft-com:office:office" xmlns:v="urn:schemas-microsoft-com:vml" xmlns:w10="urn:schemas-microsoft-com:office:word" xmlns:a="http://schemas.openxmlformats.org/drawingml/2006/main" xmlns:pic="http://schemas.openxmlformats.org/drawingml/2006/picture" xmlns:wp="http://schemas.openxmlformats.org/drawingml/2006/wordprocessingDrawing"/>
+</file>
+
+<file path=word/footnotes.xml><?xml version="1.0" encoding="utf-8"?>
+<w:footnotes xmlns:w="http://schemas.openxmlformats.org/wordprocessingml/2006/main" xmlns:m="http://schemas.openxmlformats.org/officeDocument/2006/math" xmlns:r="http://schemas.openxmlformats.org/officeDocument/2006/relationships" xmlns:o="urn:schemas-microsoft-com:office:office" xmlns:v="urn:schemas-microsoft-com:vml" xmlns:w10="urn:schemas-microsoft-com:office:word" xmlns:a="http://schemas.openxmlformats.org/drawingml/2006/main" xmlns:pic="http://schemas.openxmlformats.org/drawingml/2006/picture" xmlns:wp="http://schemas.openxmlformats.org/drawingml/2006/wordprocessingDrawing">
+  <w:footnote w:type="continuationSeparator" w:id="0">
+    <w:p>
+      <w:r>
+        <w:continuationSeparator/>
+      </w:r>
+    </w:p>
+  </w:footnote>
+  <w:footnote w:type="separator" w:id="-1">
+    <w:p>
+      <w:r>
+        <w:separator/>
+      </w:r>
+    </w:p>
+  </w:footnote>
+</w:footnotes>
 </file>
 
 <file path=word/header1.xml><?xml version="1.0" encoding="utf-8"?>
@@ -89,7 +386,7 @@
 </file>
 
 <file path=word/numbering.xml><?xml version="1.0" encoding="utf-8"?>
-<w:numbering xmlns:mc="http://schemas.openxmlformats.org/markup-compatibility/2006" xmlns:o="urn:schemas-microsoft-com:office:office" xmlns:r="http://schemas.openxmlformats.org/officeDocument/2006/relationships" xmlns:m="http://schemas.openxmlformats.org/officeDocument/2006/math" xmlns:v="urn:schemas-microsoft-com:vml" xmlns:wp="http://schemas.openxmlformats.org/drawingml/2006/wordprocessingDrawing" xmlns:w10="urn:schemas-microsoft-com:office:word" xmlns:w="http://schemas.openxmlformats.org/wordprocessingml/2006/main" xmlns:wne="http://schemas.microsoft.com/office/word/2006/wordml" xmlns:sl="http://schemas.openxmlformats.org/schemaLibrary/2006/main" xmlns:a="http://schemas.openxmlformats.org/drawingml/2006/main" xmlns:pic="http://schemas.openxmlformats.org/drawingml/2006/picture" xmlns:c="http://schemas.openxmlformats.org/drawingml/2006/chart" xmlns:lc="http://schemas.openxmlformats.org/drawingml/2006/lockedCanvas" xmlns:dgm="http://schemas.openxmlformats.org/drawingml/2006/diagram" xmlns:wps="http://schemas.microsoft.com/office/word/2010/wordprocessingShape" xmlns:wpg="http://schemas.microsoft.com/office/word/2010/wordprocessingGroup" xmlns:w14="http://schemas.microsoft.com/office/word/2010/wordml" xmlns:w15="http://schemas.microsoft.com/office/word/2012/wordml" xmlns:w16="http://schemas.microsoft.com/office/word/2018/wordml" xmlns:w16cex="http://schemas.microsoft.com/office/word/2018/wordml/cex" xmlns:w16cid="http://schemas.microsoft.com/office/word/2016/wordml/cid" xmlns="http://schemas.microsoft.com/office/tasks/2019/documenttasks" xmlns:cr="http://schemas.microsoft.com/office/comments/2020/reactions">
+<w:numbering xmlns="http://schemas.microsoft.com/office/tasks/2019/documenttasks" xmlns:a="http://schemas.openxmlformats.org/drawingml/2006/main" xmlns:c="http://schemas.openxmlformats.org/drawingml/2006/chart" xmlns:cr="http://schemas.microsoft.com/office/comments/2020/reactions" xmlns:dgm="http://schemas.openxmlformats.org/drawingml/2006/diagram" xmlns:lc="http://schemas.openxmlformats.org/drawingml/2006/lockedCanvas" xmlns:m="http://schemas.openxmlformats.org/officeDocument/2006/math" xmlns:mc="http://schemas.openxmlformats.org/markup-compatibility/2006" xmlns:o="urn:schemas-microsoft-com:office:office" xmlns:pic="http://schemas.openxmlformats.org/drawingml/2006/picture" xmlns:r="http://schemas.openxmlformats.org/officeDocument/2006/relationships" xmlns:sl="http://schemas.openxmlformats.org/schemaLibrary/2006/main" xmlns:v="urn:schemas-microsoft-com:vml" xmlns:w="http://schemas.openxmlformats.org/wordprocessingml/2006/main" xmlns:w10="urn:schemas-microsoft-com:office:word" xmlns:w14="http://schemas.microsoft.com/office/word/2010/wordml" xmlns:w15="http://schemas.microsoft.com/office/word/2012/wordml" xmlns:w16="http://schemas.microsoft.com/office/word/2018/wordml" xmlns:w16cex="http://schemas.microsoft.com/office/word/2018/wordml/cex" xmlns:w16cid="http://schemas.microsoft.com/office/word/2016/wordml/cid" xmlns:wne="http://schemas.microsoft.com/office/word/2006/wordml" xmlns:wp="http://schemas.openxmlformats.org/drawingml/2006/wordprocessingDrawing" xmlns:wpg="http://schemas.microsoft.com/office/word/2010/wordprocessingGroup" xmlns:wps="http://schemas.microsoft.com/office/word/2010/wordprocessingShape">
   <w:abstractNum w:abstractNumId="1">
     <w:lvl w:ilvl="0">
       <w:start w:val="1"/>
@@ -97,7 +394,7 @@
       <w:lvlText w:val="●"/>
       <w:lvlJc w:val="left"/>
       <w:pPr>
-        <w:ind w:left="720" w:hanging="360"/>
+        <w:ind w:hanging="360" w:left="720"/>
       </w:pPr>
       <w:rPr>
         <w:u w:val="none"/>
@@ -109,7 +406,7 @@
       <w:lvlText w:val="○"/>
       <w:lvlJc w:val="left"/>
       <w:pPr>
-        <w:ind w:left="1440" w:hanging="360"/>
+        <w:ind w:hanging="360" w:left="1440"/>
       </w:pPr>
       <w:rPr>
         <w:u w:val="none"/>
@@ -121,7 +418,7 @@
       <w:lvlText w:val="■"/>
       <w:lvlJc w:val="left"/>
       <w:pPr>
-        <w:ind w:left="2160" w:hanging="360"/>
+        <w:ind w:hanging="360" w:left="2160"/>
       </w:pPr>
       <w:rPr>
         <w:u w:val="none"/>
@@ -133,7 +430,7 @@
       <w:lvlText w:val="●"/>
       <w:lvlJc w:val="left"/>
       <w:pPr>
-        <w:ind w:left="2880" w:hanging="360"/>
+        <w:ind w:hanging="360" w:left="2880"/>
       </w:pPr>
       <w:rPr>
         <w:u w:val="none"/>
@@ -145,7 +442,7 @@
       <w:lvlText w:val="○"/>
       <w:lvlJc w:val="left"/>
       <w:pPr>
-        <w:ind w:left="3600" w:hanging="360"/>
+        <w:ind w:hanging="360" w:left="3600"/>
       </w:pPr>
       <w:rPr>
         <w:u w:val="none"/>
@@ -157,7 +454,7 @@
       <w:lvlText w:val="■"/>
       <w:lvlJc w:val="left"/>
       <w:pPr>
-        <w:ind w:left="4320" w:hanging="360"/>
+        <w:ind w:hanging="360" w:left="4320"/>
       </w:pPr>
       <w:rPr>
         <w:u w:val="none"/>
@@ -169,7 +466,7 @@
       <w:lvlText w:val="●"/>
       <w:lvlJc w:val="left"/>
       <w:pPr>
-        <w:ind w:left="5040" w:hanging="360"/>
+        <w:ind w:hanging="360" w:left="5040"/>
       </w:pPr>
       <w:rPr>
         <w:u w:val="none"/>
@@ -181,7 +478,7 @@
       <w:lvlText w:val="○"/>
       <w:lvlJc w:val="left"/>
       <w:pPr>
-        <w:ind w:left="5760" w:hanging="360"/>
+        <w:ind w:hanging="360" w:left="5760"/>
       </w:pPr>
       <w:rPr>
         <w:u w:val="none"/>
@@ -193,7 +490,7 @@
       <w:lvlText w:val="■"/>
       <w:lvlJc w:val="left"/>
       <w:pPr>
-        <w:ind w:left="6480" w:hanging="360"/>
+        <w:ind w:hanging="360" w:left="6480"/>
       </w:pPr>
       <w:rPr>
         <w:u w:val="none"/>
@@ -207,7 +504,7 @@
       <w:lvlText w:val="●"/>
       <w:lvlJc w:val="left"/>
       <w:pPr>
-        <w:ind w:left="720" w:hanging="360"/>
+        <w:ind w:hanging="360" w:left="720"/>
       </w:pPr>
       <w:rPr>
         <w:u w:val="none"/>
@@ -219,7 +516,7 @@
       <w:lvlText w:val="○"/>
       <w:lvlJc w:val="left"/>
       <w:pPr>
-        <w:ind w:left="1440" w:hanging="360"/>
+        <w:ind w:hanging="360" w:left="1440"/>
       </w:pPr>
       <w:rPr>
         <w:u w:val="none"/>
@@ -231,7 +528,7 @@
       <w:lvlText w:val="■"/>
       <w:lvlJc w:val="left"/>
       <w:pPr>
-        <w:ind w:left="2160" w:hanging="360"/>
+        <w:ind w:hanging="360" w:left="2160"/>
       </w:pPr>
       <w:rPr>
         <w:u w:val="none"/>
@@ -243,7 +540,7 @@
       <w:lvlText w:val="●"/>
       <w:lvlJc w:val="left"/>
       <w:pPr>
-        <w:ind w:left="2880" w:hanging="360"/>
+        <w:ind w:hanging="360" w:left="2880"/>
       </w:pPr>
       <w:rPr>
         <w:u w:val="none"/>
@@ -255,7 +552,7 @@
       <w:lvlText w:val="○"/>
       <w:lvlJc w:val="left"/>
       <w:pPr>
-        <w:ind w:left="3600" w:hanging="360"/>
+        <w:ind w:hanging="360" w:left="3600"/>
       </w:pPr>
       <w:rPr>
         <w:u w:val="none"/>
@@ -267,7 +564,7 @@
       <w:lvlText w:val="■"/>
       <w:lvlJc w:val="left"/>
       <w:pPr>
-        <w:ind w:left="4320" w:hanging="360"/>
+        <w:ind w:hanging="360" w:left="4320"/>
       </w:pPr>
       <w:rPr>
         <w:u w:val="none"/>
@@ -279,7 +576,7 @@
       <w:lvlText w:val="●"/>
       <w:lvlJc w:val="left"/>
       <w:pPr>
-        <w:ind w:left="5040" w:hanging="360"/>
+        <w:ind w:hanging="360" w:left="5040"/>
       </w:pPr>
       <w:rPr>
         <w:u w:val="none"/>
@@ -291,7 +588,7 @@
       <w:lvlText w:val="○"/>
       <w:lvlJc w:val="left"/>
       <w:pPr>
-        <w:ind w:left="5760" w:hanging="360"/>
+        <w:ind w:hanging="360" w:left="5760"/>
       </w:pPr>
       <w:rPr>
         <w:u w:val="none"/>
@@ -303,7 +600,7 @@
       <w:lvlText w:val="■"/>
       <w:lvlJc w:val="left"/>
       <w:pPr>
-        <w:ind w:left="6480" w:hanging="360"/>
+        <w:ind w:hanging="360" w:left="6480"/>
       </w:pPr>
       <w:rPr>
         <w:u w:val="none"/>
@@ -317,7 +614,7 @@
       <w:lvlText w:val="●"/>
       <w:lvlJc w:val="left"/>
       <w:pPr>
-        <w:ind w:left="720" w:hanging="360"/>
+        <w:ind w:hanging="360" w:left="720"/>
       </w:pPr>
       <w:rPr>
         <w:u w:val="none"/>
@@ -329,7 +626,7 @@
       <w:lvlText w:val="○"/>
       <w:lvlJc w:val="left"/>
       <w:pPr>
-        <w:ind w:left="1440" w:hanging="360"/>
+        <w:ind w:hanging="360" w:left="1440"/>
       </w:pPr>
       <w:rPr>
         <w:u w:val="none"/>
@@ -341,7 +638,7 @@
       <w:lvlText w:val="■"/>
       <w:lvlJc w:val="left"/>
       <w:pPr>
-        <w:ind w:left="2160" w:hanging="360"/>
+        <w:ind w:hanging="360" w:left="2160"/>
       </w:pPr>
       <w:rPr>
         <w:u w:val="none"/>
@@ -353,7 +650,7 @@
       <w:lvlText w:val="●"/>
       <w:lvlJc w:val="left"/>
       <w:pPr>
-        <w:ind w:left="2880" w:hanging="360"/>
+        <w:ind w:hanging="360" w:left="2880"/>
       </w:pPr>
       <w:rPr>
         <w:u w:val="none"/>
@@ -365,7 +662,7 @@
       <w:lvlText w:val="○"/>
       <w:lvlJc w:val="left"/>
       <w:pPr>
-        <w:ind w:left="3600" w:hanging="360"/>
+        <w:ind w:hanging="360" w:left="3600"/>
       </w:pPr>
       <w:rPr>
         <w:u w:val="none"/>
@@ -377,7 +674,7 @@
       <w:lvlText w:val="■"/>
       <w:lvlJc w:val="left"/>
       <w:pPr>
-        <w:ind w:left="4320" w:hanging="360"/>
+        <w:ind w:hanging="360" w:left="4320"/>
       </w:pPr>
       <w:rPr>
         <w:u w:val="none"/>
@@ -389,7 +686,7 @@
       <w:lvlText w:val="●"/>
       <w:lvlJc w:val="left"/>
       <w:pPr>
-        <w:ind w:left="5040" w:hanging="360"/>
+        <w:ind w:hanging="360" w:left="5040"/>
       </w:pPr>
       <w:rPr>
         <w:u w:val="none"/>
@@ -401,7 +698,7 @@
       <w:lvlText w:val="○"/>
       <w:lvlJc w:val="left"/>
       <w:pPr>
-        <w:ind w:left="5760" w:hanging="360"/>
+        <w:ind w:hanging="360" w:left="5760"/>
       </w:pPr>
       <w:rPr>
         <w:u w:val="none"/>
@@ -413,7 +710,7 @@
       <w:lvlText w:val="■"/>
       <w:lvlJc w:val="left"/>
       <w:pPr>
-        <w:ind w:left="6480" w:hanging="360"/>
+        <w:ind w:hanging="360" w:left="6480"/>
       </w:pPr>
       <w:rPr>
         <w:u w:val="none"/>
@@ -427,7 +724,7 @@
       <w:lvlText w:val="●"/>
       <w:lvlJc w:val="left"/>
       <w:pPr>
-        <w:ind w:left="720" w:hanging="360"/>
+        <w:ind w:hanging="360" w:left="720"/>
       </w:pPr>
       <w:rPr>
         <w:u w:val="none"/>
@@ -439,7 +736,7 @@
       <w:lvlText w:val="○"/>
       <w:lvlJc w:val="left"/>
       <w:pPr>
-        <w:ind w:left="1440" w:hanging="360"/>
+        <w:ind w:hanging="360" w:left="1440"/>
       </w:pPr>
       <w:rPr>
         <w:u w:val="none"/>
@@ -451,7 +748,7 @@
       <w:lvlText w:val="■"/>
       <w:lvlJc w:val="left"/>
       <w:pPr>
-        <w:ind w:left="2160" w:hanging="360"/>
+        <w:ind w:hanging="360" w:left="2160"/>
       </w:pPr>
       <w:rPr>
         <w:u w:val="none"/>
@@ -463,7 +760,7 @@
       <w:lvlText w:val="●"/>
       <w:lvlJc w:val="left"/>
       <w:pPr>
-        <w:ind w:left="2880" w:hanging="360"/>
+        <w:ind w:hanging="360" w:left="2880"/>
       </w:pPr>
       <w:rPr>
         <w:u w:val="none"/>
@@ -475,7 +772,7 @@
       <w:lvlText w:val="○"/>
       <w:lvlJc w:val="left"/>
       <w:pPr>
-        <w:ind w:left="3600" w:hanging="360"/>
+        <w:ind w:hanging="360" w:left="3600"/>
       </w:pPr>
       <w:rPr>
         <w:u w:val="none"/>
@@ -487,7 +784,7 @@
       <w:lvlText w:val="■"/>
       <w:lvlJc w:val="left"/>
       <w:pPr>
-        <w:ind w:left="4320" w:hanging="360"/>
+        <w:ind w:hanging="360" w:left="4320"/>
       </w:pPr>
       <w:rPr>
         <w:u w:val="none"/>
@@ -499,7 +796,7 @@
       <w:lvlText w:val="●"/>
       <w:lvlJc w:val="left"/>
       <w:pPr>
-        <w:ind w:left="5040" w:hanging="360"/>
+        <w:ind w:hanging="360" w:left="5040"/>
       </w:pPr>
       <w:rPr>
         <w:u w:val="none"/>
@@ -511,7 +808,7 @@
       <w:lvlText w:val="○"/>
       <w:lvlJc w:val="left"/>
       <w:pPr>
-        <w:ind w:left="5760" w:hanging="360"/>
+        <w:ind w:hanging="360" w:left="5760"/>
       </w:pPr>
       <w:rPr>
         <w:u w:val="none"/>
@@ -523,7 +820,7 @@
       <w:lvlText w:val="■"/>
       <w:lvlJc w:val="left"/>
       <w:pPr>
-        <w:ind w:left="6480" w:hanging="360"/>
+        <w:ind w:hanging="360" w:left="6480"/>
       </w:pPr>
       <w:rPr>
         <w:u w:val="none"/>
@@ -537,7 +834,7 @@
       <w:lvlText w:val="%1."/>
       <w:lvlJc w:val="left"/>
       <w:pPr>
-        <w:ind w:left="720" w:hanging="360"/>
+        <w:ind w:hanging="360" w:left="720"/>
       </w:pPr>
       <w:rPr>
         <w:u w:val="none"/>
@@ -549,7 +846,7 @@
       <w:lvlText w:val="○"/>
       <w:lvlJc w:val="left"/>
       <w:pPr>
-        <w:ind w:left="1440" w:hanging="360"/>
+        <w:ind w:hanging="360" w:left="1440"/>
       </w:pPr>
       <w:rPr>
         <w:u w:val="none"/>
@@ -561,7 +858,7 @@
       <w:lvlText w:val="%3."/>
       <w:lvlJc w:val="left"/>
       <w:pPr>
-        <w:ind w:left="2160" w:hanging="360"/>
+        <w:ind w:hanging="360" w:left="2160"/>
       </w:pPr>
       <w:rPr>
         <w:u w:val="none"/>
@@ -573,7 +870,7 @@
       <w:lvlText w:val="%4."/>
       <w:lvlJc w:val="left"/>
       <w:pPr>
-        <w:ind w:left="2880" w:hanging="360"/>
+        <w:ind w:hanging="360" w:left="2880"/>
       </w:pPr>
       <w:rPr>
         <w:u w:val="none"/>
@@ -585,7 +882,7 @@
       <w:lvlText w:val="%5."/>
       <w:lvlJc w:val="left"/>
       <w:pPr>
-        <w:ind w:left="3600" w:hanging="360"/>
+        <w:ind w:hanging="360" w:left="3600"/>
       </w:pPr>
       <w:rPr>
         <w:u w:val="none"/>
@@ -597,7 +894,7 @@
       <w:lvlText w:val="%6."/>
       <w:lvlJc w:val="left"/>
       <w:pPr>
-        <w:ind w:left="4320" w:hanging="360"/>
+        <w:ind w:hanging="360" w:left="4320"/>
       </w:pPr>
       <w:rPr>
         <w:u w:val="none"/>
@@ -609,7 +906,7 @@
       <w:lvlText w:val="%7."/>
       <w:lvlJc w:val="left"/>
       <w:pPr>
-        <w:ind w:left="5040" w:hanging="360"/>
+        <w:ind w:hanging="360" w:left="5040"/>
       </w:pPr>
       <w:rPr>
         <w:u w:val="none"/>
@@ -621,7 +918,7 @@
       <w:lvlText w:val="%8."/>
       <w:lvlJc w:val="left"/>
       <w:pPr>
-        <w:ind w:left="5760" w:hanging="360"/>
+        <w:ind w:hanging="360" w:left="5760"/>
       </w:pPr>
       <w:rPr>
         <w:u w:val="none"/>
@@ -633,7 +930,7 @@
       <w:lvlText w:val="%9."/>
       <w:lvlJc w:val="left"/>
       <w:pPr>
-        <w:ind w:left="6480" w:hanging="360"/>
+        <w:ind w:hanging="360" w:left="6480"/>
       </w:pPr>
       <w:rPr>
         <w:u w:val="none"/>
@@ -647,7 +944,7 @@
       <w:lvlText w:val="●"/>
       <w:lvlJc w:val="left"/>
       <w:pPr>
-        <w:ind w:left="720" w:hanging="360"/>
+        <w:ind w:hanging="360" w:left="720"/>
       </w:pPr>
       <w:rPr>
         <w:u w:val="none"/>
@@ -659,7 +956,7 @@
       <w:lvlText w:val="○"/>
       <w:lvlJc w:val="left"/>
       <w:pPr>
-        <w:ind w:left="1440" w:hanging="360"/>
+        <w:ind w:hanging="360" w:left="1440"/>
       </w:pPr>
       <w:rPr>
         <w:u w:val="none"/>
@@ -671,7 +968,7 @@
       <w:lvlText w:val="■"/>
       <w:lvlJc w:val="left"/>
       <w:pPr>
-        <w:ind w:left="2160" w:hanging="360"/>
+        <w:ind w:hanging="360" w:left="2160"/>
       </w:pPr>
       <w:rPr>
         <w:u w:val="none"/>
@@ -683,7 +980,7 @@
       <w:lvlText w:val="●"/>
       <w:lvlJc w:val="left"/>
       <w:pPr>
-        <w:ind w:left="2880" w:hanging="360"/>
+        <w:ind w:hanging="360" w:left="2880"/>
       </w:pPr>
       <w:rPr>
         <w:u w:val="none"/>
@@ -695,7 +992,7 @@
       <w:lvlText w:val="○"/>
       <w:lvlJc w:val="left"/>
       <w:pPr>
-        <w:ind w:left="3600" w:hanging="360"/>
+        <w:ind w:hanging="360" w:left="3600"/>
       </w:pPr>
       <w:rPr>
         <w:u w:val="none"/>
@@ -707,7 +1004,7 @@
       <w:lvlText w:val="■"/>
       <w:lvlJc w:val="left"/>
       <w:pPr>
-        <w:ind w:left="4320" w:hanging="360"/>
+        <w:ind w:hanging="360" w:left="4320"/>
       </w:pPr>
       <w:rPr>
         <w:u w:val="none"/>
@@ -719,7 +1016,7 @@
       <w:lvlText w:val="●"/>
       <w:lvlJc w:val="left"/>
       <w:pPr>
-        <w:ind w:left="5040" w:hanging="360"/>
+        <w:ind w:hanging="360" w:left="5040"/>
       </w:pPr>
       <w:rPr>
         <w:u w:val="none"/>
@@ -731,7 +1028,7 @@
       <w:lvlText w:val="○"/>
       <w:lvlJc w:val="left"/>
       <w:pPr>
-        <w:ind w:left="5760" w:hanging="360"/>
+        <w:ind w:hanging="360" w:left="5760"/>
       </w:pPr>
       <w:rPr>
         <w:u w:val="none"/>
@@ -743,7 +1040,7 @@
       <w:lvlText w:val="■"/>
       <w:lvlJc w:val="left"/>
       <w:pPr>
-        <w:ind w:left="6480" w:hanging="360"/>
+        <w:ind w:hanging="360" w:left="6480"/>
       </w:pPr>
       <w:rPr>
         <w:u w:val="none"/>
@@ -757,7 +1054,7 @@
       <w:lvlText w:val="●"/>
       <w:lvlJc w:val="left"/>
       <w:pPr>
-        <w:ind w:left="720" w:hanging="360"/>
+        <w:ind w:hanging="360" w:left="720"/>
       </w:pPr>
       <w:rPr>
         <w:u w:val="none"/>
@@ -769,7 +1066,7 @@
       <w:lvlText w:val="○"/>
       <w:lvlJc w:val="left"/>
       <w:pPr>
-        <w:ind w:left="1440" w:hanging="360"/>
+        <w:ind w:hanging="360" w:left="1440"/>
       </w:pPr>
       <w:rPr>
         <w:u w:val="none"/>
@@ -781,7 +1078,7 @@
       <w:lvlText w:val="■"/>
       <w:lvlJc w:val="left"/>
       <w:pPr>
-        <w:ind w:left="2160" w:hanging="360"/>
+        <w:ind w:hanging="360" w:left="2160"/>
       </w:pPr>
       <w:rPr>
         <w:u w:val="none"/>
@@ -793,7 +1090,7 @@
       <w:lvlText w:val="●"/>
       <w:lvlJc w:val="left"/>
       <w:pPr>
-        <w:ind w:left="2880" w:hanging="360"/>
+        <w:ind w:hanging="360" w:left="2880"/>
       </w:pPr>
       <w:rPr>
         <w:u w:val="none"/>
@@ -805,7 +1102,7 @@
       <w:lvlText w:val="○"/>
       <w:lvlJc w:val="left"/>
       <w:pPr>
-        <w:ind w:left="3600" w:hanging="360"/>
+        <w:ind w:hanging="360" w:left="3600"/>
       </w:pPr>
       <w:rPr>
         <w:u w:val="none"/>
@@ -817,7 +1114,7 @@
       <w:lvlText w:val="■"/>
       <w:lvlJc w:val="left"/>
       <w:pPr>
-        <w:ind w:left="4320" w:hanging="360"/>
+        <w:ind w:hanging="360" w:left="4320"/>
       </w:pPr>
       <w:rPr>
         <w:u w:val="none"/>
@@ -829,7 +1126,7 @@
       <w:lvlText w:val="●"/>
       <w:lvlJc w:val="left"/>
       <w:pPr>
-        <w:ind w:left="5040" w:hanging="360"/>
+        <w:ind w:hanging="360" w:left="5040"/>
       </w:pPr>
       <w:rPr>
         <w:u w:val="none"/>
@@ -841,7 +1138,7 @@
       <w:lvlText w:val="○"/>
       <w:lvlJc w:val="left"/>
       <w:pPr>
-        <w:ind w:left="5760" w:hanging="360"/>
+        <w:ind w:hanging="360" w:left="5760"/>
       </w:pPr>
       <w:rPr>
         <w:u w:val="none"/>
@@ -853,7 +1150,7 @@
       <w:lvlText w:val="■"/>
       <w:lvlJc w:val="left"/>
       <w:pPr>
-        <w:ind w:left="6480" w:hanging="360"/>
+        <w:ind w:hanging="360" w:left="6480"/>
       </w:pPr>
       <w:rPr>
         <w:u w:val="none"/>
@@ -867,7 +1164,7 @@
       <w:lvlText w:val="●"/>
       <w:lvlJc w:val="left"/>
       <w:pPr>
-        <w:ind w:left="1440" w:hanging="360"/>
+        <w:ind w:hanging="360" w:left="1440"/>
       </w:pPr>
       <w:rPr>
         <w:u w:val="none"/>
@@ -879,7 +1176,7 @@
       <w:lvlText w:val="○"/>
       <w:lvlJc w:val="left"/>
       <w:pPr>
-        <w:ind w:left="2160" w:hanging="360"/>
+        <w:ind w:hanging="360" w:left="2160"/>
       </w:pPr>
       <w:rPr>
         <w:u w:val="none"/>
@@ -891,7 +1188,7 @@
       <w:lvlText w:val="■"/>
       <w:lvlJc w:val="left"/>
       <w:pPr>
-        <w:ind w:left="2880" w:hanging="360"/>
+        <w:ind w:hanging="360" w:left="2880"/>
       </w:pPr>
       <w:rPr>
         <w:u w:val="none"/>
@@ -903,7 +1200,7 @@
       <w:lvlText w:val="●"/>
       <w:lvlJc w:val="left"/>
       <w:pPr>
-        <w:ind w:left="3600" w:hanging="360"/>
+        <w:ind w:hanging="360" w:left="3600"/>
       </w:pPr>
       <w:rPr>
         <w:u w:val="none"/>
@@ -915,7 +1212,7 @@
       <w:lvlText w:val="○"/>
       <w:lvlJc w:val="left"/>
       <w:pPr>
-        <w:ind w:left="4320" w:hanging="360"/>
+        <w:ind w:hanging="360" w:left="4320"/>
       </w:pPr>
       <w:rPr>
         <w:u w:val="none"/>
@@ -927,7 +1224,7 @@
       <w:lvlText w:val="■"/>
       <w:lvlJc w:val="left"/>
       <w:pPr>
-        <w:ind w:left="5040" w:hanging="360"/>
+        <w:ind w:hanging="360" w:left="5040"/>
       </w:pPr>
       <w:rPr>
         <w:u w:val="none"/>
@@ -939,7 +1236,7 @@
       <w:lvlText w:val="●"/>
       <w:lvlJc w:val="left"/>
       <w:pPr>
-        <w:ind w:left="5760" w:hanging="360"/>
+        <w:ind w:hanging="360" w:left="5760"/>
       </w:pPr>
       <w:rPr>
         <w:u w:val="none"/>
@@ -951,7 +1248,7 @@
       <w:lvlText w:val="○"/>
       <w:lvlJc w:val="left"/>
       <w:pPr>
-        <w:ind w:left="6480" w:hanging="360"/>
+        <w:ind w:hanging="360" w:left="6480"/>
       </w:pPr>
       <w:rPr>
         <w:u w:val="none"/>
@@ -963,7 +1260,7 @@
       <w:lvlText w:val="■"/>
       <w:lvlJc w:val="left"/>
       <w:pPr>
-        <w:ind w:left="7200" w:hanging="360"/>
+        <w:ind w:hanging="360" w:left="7200"/>
       </w:pPr>
       <w:rPr>
         <w:u w:val="none"/>
@@ -977,7 +1274,7 @@
       <w:lvlText w:val="●"/>
       <w:lvlJc w:val="left"/>
       <w:pPr>
-        <w:ind w:left="720" w:hanging="360"/>
+        <w:ind w:hanging="360" w:left="720"/>
       </w:pPr>
       <w:rPr>
         <w:u w:val="none"/>
@@ -989,7 +1286,7 @@
       <w:lvlText w:val="○"/>
       <w:lvlJc w:val="left"/>
       <w:pPr>
-        <w:ind w:left="1440" w:hanging="360"/>
+        <w:ind w:hanging="360" w:left="1440"/>
       </w:pPr>
       <w:rPr>
         <w:u w:val="none"/>
@@ -1001,7 +1298,7 @@
       <w:lvlText w:val="■"/>
       <w:lvlJc w:val="left"/>
       <w:pPr>
-        <w:ind w:left="2160" w:hanging="360"/>
+        <w:ind w:hanging="360" w:left="2160"/>
       </w:pPr>
       <w:rPr>
         <w:u w:val="none"/>
@@ -1013,7 +1310,7 @@
       <w:lvlText w:val="●"/>
       <w:lvlJc w:val="left"/>
       <w:pPr>
-        <w:ind w:left="2880" w:hanging="360"/>
+        <w:ind w:hanging="360" w:left="2880"/>
       </w:pPr>
       <w:rPr>
         <w:u w:val="none"/>
@@ -1025,7 +1322,7 @@
       <w:lvlText w:val="○"/>
       <w:lvlJc w:val="left"/>
       <w:pPr>
-        <w:ind w:left="3600" w:hanging="360"/>
+        <w:ind w:hanging="360" w:left="3600"/>
       </w:pPr>
       <w:rPr>
         <w:u w:val="none"/>
@@ -1037,7 +1334,7 @@
       <w:lvlText w:val="■"/>
       <w:lvlJc w:val="left"/>
       <w:pPr>
-        <w:ind w:left="4320" w:hanging="360"/>
+        <w:ind w:hanging="360" w:left="4320"/>
       </w:pPr>
       <w:rPr>
         <w:u w:val="none"/>
@@ -1049,7 +1346,7 @@
       <w:lvlText w:val="●"/>
       <w:lvlJc w:val="left"/>
       <w:pPr>
-        <w:ind w:left="5040" w:hanging="360"/>
+        <w:ind w:hanging="360" w:left="5040"/>
       </w:pPr>
       <w:rPr>
         <w:u w:val="none"/>
@@ -1061,7 +1358,7 @@
       <w:lvlText w:val="○"/>
       <w:lvlJc w:val="left"/>
       <w:pPr>
-        <w:ind w:left="5760" w:hanging="360"/>
+        <w:ind w:hanging="360" w:left="5760"/>
       </w:pPr>
       <w:rPr>
         <w:u w:val="none"/>
@@ -1073,7 +1370,7 @@
       <w:lvlText w:val="■"/>
       <w:lvlJc w:val="left"/>
       <w:pPr>
-        <w:ind w:left="6480" w:hanging="360"/>
+        <w:ind w:hanging="360" w:left="6480"/>
       </w:pPr>
       <w:rPr>
         <w:u w:val="none"/>
@@ -1087,7 +1384,7 @@
       <w:lvlText w:val="●"/>
       <w:lvlJc w:val="left"/>
       <w:pPr>
-        <w:ind w:left="720" w:hanging="360"/>
+        <w:ind w:hanging="360" w:left="720"/>
       </w:pPr>
       <w:rPr>
         <w:u w:val="none"/>
@@ -1099,7 +1396,7 @@
       <w:lvlText w:val="○"/>
       <w:lvlJc w:val="left"/>
       <w:pPr>
-        <w:ind w:left="1440" w:hanging="360"/>
+        <w:ind w:hanging="360" w:left="1440"/>
       </w:pPr>
       <w:rPr>
         <w:u w:val="none"/>
@@ -1111,7 +1408,7 @@
       <w:lvlText w:val="■"/>
       <w:lvlJc w:val="left"/>
       <w:pPr>
-        <w:ind w:left="2160" w:hanging="360"/>
+        <w:ind w:hanging="360" w:left="2160"/>
       </w:pPr>
       <w:rPr>
         <w:u w:val="none"/>
@@ -1123,7 +1420,7 @@
       <w:lvlText w:val="●"/>
       <w:lvlJc w:val="left"/>
       <w:pPr>
-        <w:ind w:left="2880" w:hanging="360"/>
+        <w:ind w:hanging="360" w:left="2880"/>
       </w:pPr>
       <w:rPr>
         <w:u w:val="none"/>
@@ -1135,7 +1432,7 @@
       <w:lvlText w:val="○"/>
       <w:lvlJc w:val="left"/>
       <w:pPr>
-        <w:ind w:left="3600" w:hanging="360"/>
+        <w:ind w:hanging="360" w:left="3600"/>
       </w:pPr>
       <w:rPr>
         <w:u w:val="none"/>
@@ -1147,7 +1444,7 @@
       <w:lvlText w:val="■"/>
       <w:lvlJc w:val="left"/>
       <w:pPr>
-        <w:ind w:left="4320" w:hanging="360"/>
+        <w:ind w:hanging="360" w:left="4320"/>
       </w:pPr>
       <w:rPr>
         <w:u w:val="none"/>
@@ -1159,7 +1456,7 @@
       <w:lvlText w:val="●"/>
       <w:lvlJc w:val="left"/>
       <w:pPr>
-        <w:ind w:left="5040" w:hanging="360"/>
+        <w:ind w:hanging="360" w:left="5040"/>
       </w:pPr>
       <w:rPr>
         <w:u w:val="none"/>
@@ -1171,7 +1468,7 @@
       <w:lvlText w:val="○"/>
       <w:lvlJc w:val="left"/>
       <w:pPr>
-        <w:ind w:left="5760" w:hanging="360"/>
+        <w:ind w:hanging="360" w:left="5760"/>
       </w:pPr>
       <w:rPr>
         <w:u w:val="none"/>
@@ -1183,7 +1480,7 @@
       <w:lvlText w:val="■"/>
       <w:lvlJc w:val="left"/>
       <w:pPr>
-        <w:ind w:left="6480" w:hanging="360"/>
+        <w:ind w:hanging="360" w:left="6480"/>
       </w:pPr>
       <w:rPr>
         <w:u w:val="none"/>
@@ -1197,7 +1494,7 @@
       <w:lvlText w:val="●"/>
       <w:lvlJc w:val="left"/>
       <w:pPr>
-        <w:ind w:left="720" w:hanging="360"/>
+        <w:ind w:hanging="360" w:left="720"/>
       </w:pPr>
       <w:rPr>
         <w:u w:val="none"/>
@@ -1209,7 +1506,7 @@
       <w:lvlText w:val="○"/>
       <w:lvlJc w:val="left"/>
       <w:pPr>
-        <w:ind w:left="1440" w:hanging="360"/>
+        <w:ind w:hanging="360" w:left="1440"/>
       </w:pPr>
       <w:rPr>
         <w:u w:val="none"/>
@@ -1221,7 +1518,7 @@
       <w:lvlText w:val="■"/>
       <w:lvlJc w:val="left"/>
       <w:pPr>
-        <w:ind w:left="2160" w:hanging="360"/>
+        <w:ind w:hanging="360" w:left="2160"/>
       </w:pPr>
       <w:rPr>
         <w:u w:val="none"/>
@@ -1233,7 +1530,7 @@
       <w:lvlText w:val="●"/>
       <w:lvlJc w:val="left"/>
       <w:pPr>
-        <w:ind w:left="2880" w:hanging="360"/>
+        <w:ind w:hanging="360" w:left="2880"/>
       </w:pPr>
       <w:rPr>
         <w:u w:val="none"/>
@@ -1245,7 +1542,7 @@
       <w:lvlText w:val="○"/>
       <w:lvlJc w:val="left"/>
       <w:pPr>
-        <w:ind w:left="3600" w:hanging="360"/>
+        <w:ind w:hanging="360" w:left="3600"/>
       </w:pPr>
       <w:rPr>
         <w:u w:val="none"/>
@@ -1257,7 +1554,7 @@
       <w:lvlText w:val="■"/>
       <w:lvlJc w:val="left"/>
       <w:pPr>
-        <w:ind w:left="4320" w:hanging="360"/>
+        <w:ind w:hanging="360" w:left="4320"/>
       </w:pPr>
       <w:rPr>
         <w:u w:val="none"/>
@@ -1269,7 +1566,7 @@
       <w:lvlText w:val="●"/>
       <w:lvlJc w:val="left"/>
       <w:pPr>
-        <w:ind w:left="5040" w:hanging="360"/>
+        <w:ind w:hanging="360" w:left="5040"/>
       </w:pPr>
       <w:rPr>
         <w:u w:val="none"/>
@@ -1281,7 +1578,7 @@
       <w:lvlText w:val="○"/>
       <w:lvlJc w:val="left"/>
       <w:pPr>
-        <w:ind w:left="5760" w:hanging="360"/>
+        <w:ind w:hanging="360" w:left="5760"/>
       </w:pPr>
       <w:rPr>
         <w:u w:val="none"/>
@@ -1293,7 +1590,7 @@
       <w:lvlText w:val="■"/>
       <w:lvlJc w:val="left"/>
       <w:pPr>
-        <w:ind w:left="6480" w:hanging="360"/>
+        <w:ind w:hanging="360" w:left="6480"/>
       </w:pPr>
       <w:rPr>
         <w:u w:val="none"/>
@@ -1307,7 +1604,7 @@
       <w:lvlText w:val="●"/>
       <w:lvlJc w:val="left"/>
       <w:pPr>
-        <w:ind w:left="720" w:hanging="360"/>
+        <w:ind w:hanging="360" w:left="720"/>
       </w:pPr>
       <w:rPr>
         <w:u w:val="none"/>
@@ -1319,7 +1616,7 @@
       <w:lvlText w:val="○"/>
       <w:lvlJc w:val="left"/>
       <w:pPr>
-        <w:ind w:left="1440" w:hanging="360"/>
+        <w:ind w:hanging="360" w:left="1440"/>
       </w:pPr>
       <w:rPr>
         <w:u w:val="none"/>
@@ -1331,7 +1628,7 @@
       <w:lvlText w:val="■"/>
       <w:lvlJc w:val="left"/>
       <w:pPr>
-        <w:ind w:left="2160" w:hanging="360"/>
+        <w:ind w:hanging="360" w:left="2160"/>
       </w:pPr>
       <w:rPr>
         <w:u w:val="none"/>
@@ -1343,7 +1640,7 @@
       <w:lvlText w:val="●"/>
       <w:lvlJc w:val="left"/>
       <w:pPr>
-        <w:ind w:left="2880" w:hanging="360"/>
+        <w:ind w:hanging="360" w:left="2880"/>
       </w:pPr>
       <w:rPr>
         <w:u w:val="none"/>
@@ -1355,7 +1652,7 @@
       <w:lvlText w:val="○"/>
       <w:lvlJc w:val="left"/>
       <w:pPr>
-        <w:ind w:left="3600" w:hanging="360"/>
+        <w:ind w:hanging="360" w:left="3600"/>
       </w:pPr>
       <w:rPr>
         <w:u w:val="none"/>
@@ -1367,7 +1664,7 @@
       <w:lvlText w:val="■"/>
       <w:lvlJc w:val="left"/>
       <w:pPr>
-        <w:ind w:left="4320" w:hanging="360"/>
+        <w:ind w:hanging="360" w:left="4320"/>
       </w:pPr>
       <w:rPr>
         <w:u w:val="none"/>
@@ -1379,7 +1676,7 @@
       <w:lvlText w:val="●"/>
       <w:lvlJc w:val="left"/>
       <w:pPr>
-        <w:ind w:left="5040" w:hanging="360"/>
+        <w:ind w:hanging="360" w:left="5040"/>
       </w:pPr>
       <w:rPr>
         <w:u w:val="none"/>
@@ -1391,7 +1688,7 @@
       <w:lvlText w:val="○"/>
       <w:lvlJc w:val="left"/>
       <w:pPr>
-        <w:ind w:left="5760" w:hanging="360"/>
+        <w:ind w:hanging="360" w:left="5760"/>
       </w:pPr>
       <w:rPr>
         <w:u w:val="none"/>
@@ -1403,7 +1700,7 @@
       <w:lvlText w:val="■"/>
       <w:lvlJc w:val="left"/>
       <w:pPr>
-        <w:ind w:left="6480" w:hanging="360"/>
+        <w:ind w:hanging="360" w:left="6480"/>
       </w:pPr>
       <w:rPr>
         <w:u w:val="none"/>
@@ -1417,7 +1714,7 @@
       <w:lvlText w:val="●"/>
       <w:lvlJc w:val="left"/>
       <w:pPr>
-        <w:ind w:left="720" w:hanging="360"/>
+        <w:ind w:hanging="360" w:left="720"/>
       </w:pPr>
       <w:rPr>
         <w:u w:val="none"/>
@@ -1429,7 +1726,7 @@
       <w:lvlText w:val="○"/>
       <w:lvlJc w:val="left"/>
       <w:pPr>
-        <w:ind w:left="1440" w:hanging="360"/>
+        <w:ind w:hanging="360" w:left="1440"/>
       </w:pPr>
       <w:rPr>
         <w:u w:val="none"/>
@@ -1441,7 +1738,7 @@
       <w:lvlText w:val="■"/>
       <w:lvlJc w:val="left"/>
       <w:pPr>
-        <w:ind w:left="2160" w:hanging="360"/>
+        <w:ind w:hanging="360" w:left="2160"/>
       </w:pPr>
       <w:rPr>
         <w:u w:val="none"/>
@@ -1453,7 +1750,7 @@
       <w:lvlText w:val="●"/>
       <w:lvlJc w:val="left"/>
       <w:pPr>
-        <w:ind w:left="2880" w:hanging="360"/>
+        <w:ind w:hanging="360" w:left="2880"/>
       </w:pPr>
       <w:rPr>
         <w:u w:val="none"/>
@@ -1465,7 +1762,7 @@
       <w:lvlText w:val="○"/>
       <w:lvlJc w:val="left"/>
       <w:pPr>
-        <w:ind w:left="3600" w:hanging="360"/>
+        <w:ind w:hanging="360" w:left="3600"/>
       </w:pPr>
       <w:rPr>
         <w:u w:val="none"/>
@@ -1477,7 +1774,7 @@
       <w:lvlText w:val="■"/>
       <w:lvlJc w:val="left"/>
       <w:pPr>
-        <w:ind w:left="4320" w:hanging="360"/>
+        <w:ind w:hanging="360" w:left="4320"/>
       </w:pPr>
       <w:rPr>
         <w:u w:val="none"/>
@@ -1489,7 +1786,7 @@
       <w:lvlText w:val="●"/>
       <w:lvlJc w:val="left"/>
       <w:pPr>
-        <w:ind w:left="5040" w:hanging="360"/>
+        <w:ind w:hanging="360" w:left="5040"/>
       </w:pPr>
       <w:rPr>
         <w:u w:val="none"/>
@@ -1501,7 +1798,7 @@
       <w:lvlText w:val="○"/>
       <w:lvlJc w:val="left"/>
       <w:pPr>
-        <w:ind w:left="5760" w:hanging="360"/>
+        <w:ind w:hanging="360" w:left="5760"/>
       </w:pPr>
       <w:rPr>
         <w:u w:val="none"/>
@@ -1513,7 +1810,7 @@
       <w:lvlText w:val="■"/>
       <w:lvlJc w:val="left"/>
       <w:pPr>
-        <w:ind w:left="6480" w:hanging="360"/>
+        <w:ind w:hanging="360" w:left="6480"/>
       </w:pPr>
       <w:rPr>
         <w:u w:val="none"/>
@@ -1527,7 +1824,7 @@
       <w:lvlText w:val="●"/>
       <w:lvlJc w:val="left"/>
       <w:pPr>
-        <w:ind w:left="720" w:hanging="360"/>
+        <w:ind w:hanging="360" w:left="720"/>
       </w:pPr>
       <w:rPr>
         <w:u w:val="none"/>
@@ -1539,7 +1836,7 @@
       <w:lvlText w:val="○"/>
       <w:lvlJc w:val="left"/>
       <w:pPr>
-        <w:ind w:left="1440" w:hanging="360"/>
+        <w:ind w:hanging="360" w:left="1440"/>
       </w:pPr>
       <w:rPr>
         <w:u w:val="none"/>
@@ -1551,7 +1848,7 @@
       <w:lvlText w:val="■"/>
       <w:lvlJc w:val="left"/>
       <w:pPr>
-        <w:ind w:left="2160" w:hanging="360"/>
+        <w:ind w:hanging="360" w:left="2160"/>
       </w:pPr>
       <w:rPr>
         <w:u w:val="none"/>
@@ -1563,7 +1860,7 @@
       <w:lvlText w:val="●"/>
       <w:lvlJc w:val="left"/>
       <w:pPr>
-        <w:ind w:left="2880" w:hanging="360"/>
+        <w:ind w:hanging="360" w:left="2880"/>
       </w:pPr>
       <w:rPr>
         <w:u w:val="none"/>
@@ -1575,7 +1872,7 @@
       <w:lvlText w:val="○"/>
       <w:lvlJc w:val="left"/>
       <w:pPr>
-        <w:ind w:left="3600" w:hanging="360"/>
+        <w:ind w:hanging="360" w:left="3600"/>
       </w:pPr>
       <w:rPr>
         <w:u w:val="none"/>
@@ -1587,7 +1884,7 @@
       <w:lvlText w:val="■"/>
       <w:lvlJc w:val="left"/>
       <w:pPr>
-        <w:ind w:left="4320" w:hanging="360"/>
+        <w:ind w:hanging="360" w:left="4320"/>
       </w:pPr>
       <w:rPr>
         <w:u w:val="none"/>
@@ -1599,7 +1896,7 @@
       <w:lvlText w:val="●"/>
       <w:lvlJc w:val="left"/>
       <w:pPr>
-        <w:ind w:left="5040" w:hanging="360"/>
+        <w:ind w:hanging="360" w:left="5040"/>
       </w:pPr>
       <w:rPr>
         <w:u w:val="none"/>
@@ -1611,7 +1908,7 @@
       <w:lvlText w:val="○"/>
       <w:lvlJc w:val="left"/>
       <w:pPr>
-        <w:ind w:left="5760" w:hanging="360"/>
+        <w:ind w:hanging="360" w:left="5760"/>
       </w:pPr>
       <w:rPr>
         <w:u w:val="none"/>
@@ -1623,7 +1920,7 @@
       <w:lvlText w:val="■"/>
       <w:lvlJc w:val="left"/>
       <w:pPr>
-        <w:ind w:left="6480" w:hanging="360"/>
+        <w:ind w:hanging="360" w:left="6480"/>
       </w:pPr>
       <w:rPr>
         <w:u w:val="none"/>
@@ -1637,7 +1934,7 @@
       <w:lvlText w:val="●"/>
       <w:lvlJc w:val="left"/>
       <w:pPr>
-        <w:ind w:left="720" w:hanging="360"/>
+        <w:ind w:hanging="360" w:left="720"/>
       </w:pPr>
       <w:rPr>
         <w:u w:val="none"/>
@@ -1649,7 +1946,7 @@
       <w:lvlText w:val="○"/>
       <w:lvlJc w:val="left"/>
       <w:pPr>
-        <w:ind w:left="1440" w:hanging="360"/>
+        <w:ind w:hanging="360" w:left="1440"/>
       </w:pPr>
       <w:rPr>
         <w:u w:val="none"/>
@@ -1661,7 +1958,7 @@
       <w:lvlText w:val="■"/>
       <w:lvlJc w:val="left"/>
       <w:pPr>
-        <w:ind w:left="2160" w:hanging="360"/>
+        <w:ind w:hanging="360" w:left="2160"/>
       </w:pPr>
       <w:rPr>
         <w:u w:val="none"/>
@@ -1673,7 +1970,7 @@
       <w:lvlText w:val="●"/>
       <w:lvlJc w:val="left"/>
       <w:pPr>
-        <w:ind w:left="2880" w:hanging="360"/>
+        <w:ind w:hanging="360" w:left="2880"/>
       </w:pPr>
       <w:rPr>
         <w:u w:val="none"/>
@@ -1685,7 +1982,7 @@
       <w:lvlText w:val="○"/>
       <w:lvlJc w:val="left"/>
       <w:pPr>
-        <w:ind w:left="3600" w:hanging="360"/>
+        <w:ind w:hanging="360" w:left="3600"/>
       </w:pPr>
       <w:rPr>
         <w:u w:val="none"/>
@@ -1697,7 +1994,7 @@
       <w:lvlText w:val="■"/>
       <w:lvlJc w:val="left"/>
       <w:pPr>
-        <w:ind w:left="4320" w:hanging="360"/>
+        <w:ind w:hanging="360" w:left="4320"/>
       </w:pPr>
       <w:rPr>
         <w:u w:val="none"/>
@@ -1709,7 +2006,7 @@
       <w:lvlText w:val="●"/>
       <w:lvlJc w:val="left"/>
       <w:pPr>
-        <w:ind w:left="5040" w:hanging="360"/>
+        <w:ind w:hanging="360" w:left="5040"/>
       </w:pPr>
       <w:rPr>
         <w:u w:val="none"/>
@@ -1721,7 +2018,7 @@
       <w:lvlText w:val="○"/>
       <w:lvlJc w:val="left"/>
       <w:pPr>
-        <w:ind w:left="5760" w:hanging="360"/>
+        <w:ind w:hanging="360" w:left="5760"/>
       </w:pPr>
       <w:rPr>
         <w:u w:val="none"/>
@@ -1733,7 +2030,7 @@
       <w:lvlText w:val="■"/>
       <w:lvlJc w:val="left"/>
       <w:pPr>
-        <w:ind w:left="6480" w:hanging="360"/>
+        <w:ind w:hanging="360" w:left="6480"/>
       </w:pPr>
       <w:rPr>
         <w:u w:val="none"/>
@@ -1747,7 +2044,7 @@
       <w:lvlText w:val="●"/>
       <w:lvlJc w:val="left"/>
       <w:pPr>
-        <w:ind w:left="720" w:hanging="360"/>
+        <w:ind w:hanging="360" w:left="720"/>
       </w:pPr>
       <w:rPr>
         <w:u w:val="none"/>
@@ -1759,7 +2056,7 @@
       <w:lvlText w:val="○"/>
       <w:lvlJc w:val="left"/>
       <w:pPr>
-        <w:ind w:left="1440" w:hanging="360"/>
+        <w:ind w:hanging="360" w:left="1440"/>
       </w:pPr>
       <w:rPr>
         <w:u w:val="none"/>
@@ -1771,7 +2068,7 @@
       <w:lvlText w:val="■"/>
       <w:lvlJc w:val="left"/>
       <w:pPr>
-        <w:ind w:left="2160" w:hanging="360"/>
+        <w:ind w:hanging="360" w:left="2160"/>
       </w:pPr>
       <w:rPr>
         <w:u w:val="none"/>
@@ -1783,7 +2080,7 @@
       <w:lvlText w:val="●"/>
       <w:lvlJc w:val="left"/>
       <w:pPr>
-        <w:ind w:left="2880" w:hanging="360"/>
+        <w:ind w:hanging="360" w:left="2880"/>
       </w:pPr>
       <w:rPr>
         <w:u w:val="none"/>
@@ -1795,7 +2092,7 @@
       <w:lvlText w:val="○"/>
       <w:lvlJc w:val="left"/>
       <w:pPr>
-        <w:ind w:left="3600" w:hanging="360"/>
+        <w:ind w:hanging="360" w:left="3600"/>
       </w:pPr>
       <w:rPr>
         <w:u w:val="none"/>
@@ -1807,7 +2104,7 @@
       <w:lvlText w:val="■"/>
       <w:lvlJc w:val="left"/>
       <w:pPr>
-        <w:ind w:left="4320" w:hanging="360"/>
+        <w:ind w:hanging="360" w:left="4320"/>
       </w:pPr>
       <w:rPr>
         <w:u w:val="none"/>
@@ -1819,7 +2116,7 @@
       <w:lvlText w:val="●"/>
       <w:lvlJc w:val="left"/>
       <w:pPr>
-        <w:ind w:left="5040" w:hanging="360"/>
+        <w:ind w:hanging="360" w:left="5040"/>
       </w:pPr>
       <w:rPr>
         <w:u w:val="none"/>
@@ -1831,7 +2128,7 @@
       <w:lvlText w:val="○"/>
       <w:lvlJc w:val="left"/>
       <w:pPr>
-        <w:ind w:left="5760" w:hanging="360"/>
+        <w:ind w:hanging="360" w:left="5760"/>
       </w:pPr>
       <w:rPr>
         <w:u w:val="none"/>
@@ -1843,7 +2140,7 @@
       <w:lvlText w:val="■"/>
       <w:lvlJc w:val="left"/>
       <w:pPr>
-        <w:ind w:left="6480" w:hanging="360"/>
+        <w:ind w:hanging="360" w:left="6480"/>
       </w:pPr>
       <w:rPr>
         <w:u w:val="none"/>
@@ -1857,107 +2154,371 @@
       <w:lvlText w:val="●"/>
       <w:lvlJc w:val="left"/>
       <w:pPr>
+        <w:ind w:hanging="360" w:left="720"/>
+      </w:pPr>
+      <w:rPr>
+        <w:u w:val="none"/>
+      </w:rPr>
+    </w:lvl>
+    <w:lvl w:ilvl="1">
+      <w:start w:val="1"/>
+      <w:numFmt w:val="bullet"/>
+      <w:lvlText w:val="○"/>
+      <w:lvlJc w:val="left"/>
+      <w:pPr>
+        <w:ind w:hanging="360" w:left="1440"/>
+      </w:pPr>
+      <w:rPr>
+        <w:u w:val="none"/>
+      </w:rPr>
+    </w:lvl>
+    <w:lvl w:ilvl="2">
+      <w:start w:val="1"/>
+      <w:numFmt w:val="bullet"/>
+      <w:lvlText w:val="■"/>
+      <w:lvlJc w:val="left"/>
+      <w:pPr>
+        <w:ind w:hanging="360" w:left="2160"/>
+      </w:pPr>
+      <w:rPr>
+        <w:u w:val="none"/>
+      </w:rPr>
+    </w:lvl>
+    <w:lvl w:ilvl="3">
+      <w:start w:val="1"/>
+      <w:numFmt w:val="bullet"/>
+      <w:lvlText w:val="●"/>
+      <w:lvlJc w:val="left"/>
+      <w:pPr>
+        <w:ind w:hanging="360" w:left="2880"/>
+      </w:pPr>
+      <w:rPr>
+        <w:u w:val="none"/>
+      </w:rPr>
+    </w:lvl>
+    <w:lvl w:ilvl="4">
+      <w:start w:val="1"/>
+      <w:numFmt w:val="bullet"/>
+      <w:lvlText w:val="○"/>
+      <w:lvlJc w:val="left"/>
+      <w:pPr>
+        <w:ind w:hanging="360" w:left="3600"/>
+      </w:pPr>
+      <w:rPr>
+        <w:u w:val="none"/>
+      </w:rPr>
+    </w:lvl>
+    <w:lvl w:ilvl="5">
+      <w:start w:val="1"/>
+      <w:numFmt w:val="bullet"/>
+      <w:lvlText w:val="■"/>
+      <w:lvlJc w:val="left"/>
+      <w:pPr>
+        <w:ind w:hanging="360" w:left="4320"/>
+      </w:pPr>
+      <w:rPr>
+        <w:u w:val="none"/>
+      </w:rPr>
+    </w:lvl>
+    <w:lvl w:ilvl="6">
+      <w:start w:val="1"/>
+      <w:numFmt w:val="bullet"/>
+      <w:lvlText w:val="●"/>
+      <w:lvlJc w:val="left"/>
+      <w:pPr>
+        <w:ind w:hanging="360" w:left="5040"/>
+      </w:pPr>
+      <w:rPr>
+        <w:u w:val="none"/>
+      </w:rPr>
+    </w:lvl>
+    <w:lvl w:ilvl="7">
+      <w:start w:val="1"/>
+      <w:numFmt w:val="bullet"/>
+      <w:lvlText w:val="○"/>
+      <w:lvlJc w:val="left"/>
+      <w:pPr>
+        <w:ind w:hanging="360" w:left="5760"/>
+      </w:pPr>
+      <w:rPr>
+        <w:u w:val="none"/>
+      </w:rPr>
+    </w:lvl>
+    <w:lvl w:ilvl="8">
+      <w:start w:val="1"/>
+      <w:numFmt w:val="bullet"/>
+      <w:lvlText w:val="■"/>
+      <w:lvlJc w:val="left"/>
+      <w:pPr>
+        <w:ind w:hanging="360" w:left="6480"/>
+      </w:pPr>
+      <w:rPr>
+        <w:u w:val="none"/>
+      </w:rPr>
+    </w:lvl>
+  </w:abstractNum>
+  <w:abstractNum w:abstractNumId="990">
+    <w:nsid w:val="0000A990"/>
+    <w:multiLevelType w:val="multilevel"/>
+    <w:lvl w:ilvl="0">
+      <w:numFmt w:val="bullet"/>
+      <w:lvlText w:val=" "/>
+      <w:lvlJc w:val="left"/>
+      <w:pPr>
         <w:ind w:left="720" w:hanging="360"/>
       </w:pPr>
-      <w:rPr>
-        <w:u w:val="none"/>
-      </w:rPr>
     </w:lvl>
     <w:lvl w:ilvl="1">
-      <w:start w:val="1"/>
-      <w:numFmt w:val="bullet"/>
-      <w:lvlText w:val="○"/>
+      <w:numFmt w:val="bullet"/>
+      <w:lvlText w:val=" "/>
       <w:lvlJc w:val="left"/>
       <w:pPr>
         <w:ind w:left="1440" w:hanging="360"/>
       </w:pPr>
-      <w:rPr>
-        <w:u w:val="none"/>
-      </w:rPr>
     </w:lvl>
     <w:lvl w:ilvl="2">
-      <w:start w:val="1"/>
-      <w:numFmt w:val="bullet"/>
-      <w:lvlText w:val="■"/>
+      <w:numFmt w:val="bullet"/>
+      <w:lvlText w:val=" "/>
       <w:lvlJc w:val="left"/>
       <w:pPr>
         <w:ind w:left="2160" w:hanging="360"/>
       </w:pPr>
-      <w:rPr>
-        <w:u w:val="none"/>
-      </w:rPr>
     </w:lvl>
     <w:lvl w:ilvl="3">
-      <w:start w:val="1"/>
-      <w:numFmt w:val="bullet"/>
-      <w:lvlText w:val="●"/>
+      <w:numFmt w:val="bullet"/>
+      <w:lvlText w:val=" "/>
       <w:lvlJc w:val="left"/>
       <w:pPr>
         <w:ind w:left="2880" w:hanging="360"/>
       </w:pPr>
-      <w:rPr>
-        <w:u w:val="none"/>
-      </w:rPr>
     </w:lvl>
     <w:lvl w:ilvl="4">
-      <w:start w:val="1"/>
-      <w:numFmt w:val="bullet"/>
-      <w:lvlText w:val="○"/>
+      <w:numFmt w:val="bullet"/>
+      <w:lvlText w:val=" "/>
       <w:lvlJc w:val="left"/>
       <w:pPr>
         <w:ind w:left="3600" w:hanging="360"/>
       </w:pPr>
-      <w:rPr>
-        <w:u w:val="none"/>
-      </w:rPr>
     </w:lvl>
     <w:lvl w:ilvl="5">
-      <w:start w:val="1"/>
-      <w:numFmt w:val="bullet"/>
-      <w:lvlText w:val="■"/>
+      <w:numFmt w:val="bullet"/>
+      <w:lvlText w:val=" "/>
       <w:lvlJc w:val="left"/>
       <w:pPr>
         <w:ind w:left="4320" w:hanging="360"/>
       </w:pPr>
-      <w:rPr>
-        <w:u w:val="none"/>
-      </w:rPr>
     </w:lvl>
     <w:lvl w:ilvl="6">
-      <w:start w:val="1"/>
-      <w:numFmt w:val="bullet"/>
-      <w:lvlText w:val="●"/>
+      <w:numFmt w:val="bullet"/>
+      <w:lvlText w:val=" "/>
       <w:lvlJc w:val="left"/>
       <w:pPr>
         <w:ind w:left="5040" w:hanging="360"/>
       </w:pPr>
-      <w:rPr>
-        <w:u w:val="none"/>
-      </w:rPr>
     </w:lvl>
     <w:lvl w:ilvl="7">
-      <w:start w:val="1"/>
-      <w:numFmt w:val="bullet"/>
-      <w:lvlText w:val="○"/>
+      <w:numFmt w:val="bullet"/>
+      <w:lvlText w:val=" "/>
       <w:lvlJc w:val="left"/>
       <w:pPr>
         <w:ind w:left="5760" w:hanging="360"/>
       </w:pPr>
-      <w:rPr>
-        <w:u w:val="none"/>
-      </w:rPr>
     </w:lvl>
     <w:lvl w:ilvl="8">
-      <w:start w:val="1"/>
-      <w:numFmt w:val="bullet"/>
-      <w:lvlText w:val="■"/>
+      <w:numFmt w:val="bullet"/>
+      <w:lvlText w:val=" "/>
       <w:lvlJc w:val="left"/>
       <w:pPr>
         <w:ind w:left="6480" w:hanging="360"/>
       </w:pPr>
-      <w:rPr>
-        <w:u w:val="none"/>
-      </w:rPr>
+    </w:lvl>
+  </w:abstractNum>
+  <w:abstractNum w:abstractNumId="991">
+    <w:nsid w:val="0000A991"/>
+    <w:multiLevelType w:val="multilevel"/>
+    <w:lvl w:ilvl="0">
+      <w:numFmt w:val="bullet"/>
+      <w:lvlText w:val=""/>
+      <w:lvlJc w:val="left"/>
+      <w:pPr>
+        <w:ind w:left="720" w:hanging="360"/>
+      </w:pPr>
+      <w:rPr>
+        <w:rFonts w:ascii="Symbol" w:hAnsi="Symbol" w:cs="Symbol" w:hint="default"/>
+      </w:rPr>
+    </w:lvl>
+    <w:lvl w:ilvl="1">
+      <w:numFmt w:val="bullet"/>
+      <w:lvlText w:val="o"/>
+      <w:lvlJc w:val="left"/>
+      <w:pPr>
+        <w:ind w:left="1440" w:hanging="360"/>
+      </w:pPr>
+      <w:rPr>
+        <w:rFonts w:ascii="Courier New" w:hAnsi="Courier New" w:cs="Courier New" w:hint="default"/>
+      </w:rPr>
+    </w:lvl>
+    <w:lvl w:ilvl="2">
+      <w:numFmt w:val="bullet"/>
+      <w:lvlText w:val=""/>
+      <w:lvlJc w:val="left"/>
+      <w:pPr>
+        <w:ind w:left="2160" w:hanging="360"/>
+      </w:pPr>
+      <w:rPr>
+        <w:rFonts w:ascii="Wingdings" w:hAnsi="Wingdings" w:cs="Wingdings" w:hint="default"/>
+      </w:rPr>
+    </w:lvl>
+    <w:lvl w:ilvl="3">
+      <w:numFmt w:val="bullet"/>
+      <w:lvlText w:val=""/>
+      <w:lvlJc w:val="left"/>
+      <w:pPr>
+        <w:ind w:left="2880" w:hanging="360"/>
+      </w:pPr>
+      <w:rPr>
+        <w:rFonts w:ascii="Symbol" w:hAnsi="Symbol" w:cs="Symbol" w:hint="default"/>
+      </w:rPr>
+    </w:lvl>
+    <w:lvl w:ilvl="4">
+      <w:numFmt w:val="bullet"/>
+      <w:lvlText w:val="o"/>
+      <w:lvlJc w:val="left"/>
+      <w:pPr>
+        <w:ind w:left="3600" w:hanging="360"/>
+      </w:pPr>
+      <w:rPr>
+        <w:rFonts w:ascii="Courier New" w:hAnsi="Courier New" w:cs="Courier New" w:hint="default"/>
+      </w:rPr>
+    </w:lvl>
+    <w:lvl w:ilvl="5">
+      <w:numFmt w:val="bullet"/>
+      <w:lvlText w:val=""/>
+      <w:lvlJc w:val="left"/>
+      <w:pPr>
+        <w:ind w:left="4320" w:hanging="360"/>
+      </w:pPr>
+      <w:rPr>
+        <w:rFonts w:ascii="Wingdings" w:hAnsi="Wingdings" w:cs="Wingdings" w:hint="default"/>
+      </w:rPr>
+    </w:lvl>
+    <w:lvl w:ilvl="6">
+      <w:numFmt w:val="bullet"/>
+      <w:lvlText w:val=""/>
+      <w:lvlJc w:val="left"/>
+      <w:pPr>
+        <w:ind w:left="5040" w:hanging="360"/>
+      </w:pPr>
+      <w:rPr>
+        <w:rFonts w:ascii="Symbol" w:hAnsi="Symbol" w:cs="Symbol" w:hint="default"/>
+      </w:rPr>
+    </w:lvl>
+    <w:lvl w:ilvl="7">
+      <w:numFmt w:val="bullet"/>
+      <w:lvlText w:val="o"/>
+      <w:lvlJc w:val="left"/>
+      <w:pPr>
+        <w:ind w:left="5760" w:hanging="360"/>
+      </w:pPr>
+      <w:rPr>
+        <w:rFonts w:ascii="Courier New" w:hAnsi="Courier New" w:cs="Courier New" w:hint="default"/>
+      </w:rPr>
+    </w:lvl>
+    <w:lvl w:ilvl="8">
+      <w:numFmt w:val="bullet"/>
+      <w:lvlText w:val=""/>
+      <w:lvlJc w:val="left"/>
+      <w:pPr>
+        <w:ind w:left="6480" w:hanging="360"/>
+      </w:pPr>
+      <w:rPr>
+        <w:rFonts w:ascii="Wingdings" w:hAnsi="Wingdings" w:cs="Wingdings" w:hint="default"/>
+      </w:rPr>
+    </w:lvl>
+  </w:abstractNum>
+  <w:abstractNum w:abstractNumId="99411">
+    <w:nsid w:val="00A99411"/>
+    <w:multiLevelType w:val="multilevel"/>
+    <w:lvl w:ilvl="0">
+      <w:start w:val="1"/>
+      <w:numFmt w:val="decimal"/>
+      <w:lvlText w:val="%1."/>
+      <w:lvlJc w:val="left"/>
+      <w:pPr>
+        <w:ind w:left="720" w:hanging="360"/>
+      </w:pPr>
+    </w:lvl>
+    <w:lvl w:ilvl="1">
+      <w:start w:val="1"/>
+      <w:numFmt w:val="decimal"/>
+      <w:lvlText w:val="%2."/>
+      <w:lvlJc w:val="left"/>
+      <w:pPr>
+        <w:ind w:left="1440" w:hanging="360"/>
+      </w:pPr>
+    </w:lvl>
+    <w:lvl w:ilvl="2">
+      <w:start w:val="1"/>
+      <w:numFmt w:val="decimal"/>
+      <w:lvlText w:val="%3."/>
+      <w:lvlJc w:val="left"/>
+      <w:pPr>
+        <w:ind w:left="2160" w:hanging="360"/>
+      </w:pPr>
+    </w:lvl>
+    <w:lvl w:ilvl="3">
+      <w:start w:val="1"/>
+      <w:numFmt w:val="decimal"/>
+      <w:lvlText w:val="%4."/>
+      <w:lvlJc w:val="left"/>
+      <w:pPr>
+        <w:ind w:left="2880" w:hanging="360"/>
+      </w:pPr>
+    </w:lvl>
+    <w:lvl w:ilvl="4">
+      <w:start w:val="1"/>
+      <w:numFmt w:val="decimal"/>
+      <w:lvlText w:val="%5."/>
+      <w:lvlJc w:val="left"/>
+      <w:pPr>
+        <w:ind w:left="3600" w:hanging="360"/>
+      </w:pPr>
+    </w:lvl>
+    <w:lvl w:ilvl="5">
+      <w:start w:val="1"/>
+      <w:numFmt w:val="decimal"/>
+      <w:lvlText w:val="%6."/>
+      <w:lvlJc w:val="left"/>
+      <w:pPr>
+        <w:ind w:left="4320" w:hanging="360"/>
+      </w:pPr>
+    </w:lvl>
+    <w:lvl w:ilvl="6">
+      <w:start w:val="1"/>
+      <w:numFmt w:val="decimal"/>
+      <w:lvlText w:val="%7."/>
+      <w:lvlJc w:val="left"/>
+      <w:pPr>
+        <w:ind w:left="5040" w:hanging="360"/>
+      </w:pPr>
+    </w:lvl>
+    <w:lvl w:ilvl="7">
+      <w:start w:val="1"/>
+      <w:numFmt w:val="decimal"/>
+      <w:lvlText w:val="%8."/>
+      <w:lvlJc w:val="left"/>
+      <w:pPr>
+        <w:ind w:left="5760" w:hanging="360"/>
+      </w:pPr>
+    </w:lvl>
+    <w:lvl w:ilvl="8">
+      <w:start w:val="1"/>
+      <w:numFmt w:val="decimal"/>
+      <w:lvlText w:val="%9."/>
+      <w:lvlJc w:val="left"/>
+      <w:pPr>
+        <w:ind w:left="6480" w:hanging="360"/>
+      </w:pPr>
     </w:lvl>
   </w:abstractNum>
   <w:num w:numId="1">
@@ -2011,11 +2572,47 @@
   <w:num w:numId="17">
     <w:abstractNumId w:val="17"/>
   </w:num>
+  <w:num w:numId="1000">
+    <w:abstractNumId w:val="990"/>
+  </w:num>
+  <w:num w:numId="1001">
+    <w:abstractNumId w:val="991"/>
+  </w:num>
+  <w:num w:numId="1002">
+    <w:abstractNumId w:val="99411"/>
+    <w:lvlOverride w:ilvl="0">
+      <w:startOverride w:val="1"/>
+    </w:lvlOverride>
+    <w:lvlOverride w:ilvl="1">
+      <w:startOverride w:val="1"/>
+    </w:lvlOverride>
+    <w:lvlOverride w:ilvl="2">
+      <w:startOverride w:val="1"/>
+    </w:lvlOverride>
+    <w:lvlOverride w:ilvl="3">
+      <w:startOverride w:val="1"/>
+    </w:lvlOverride>
+    <w:lvlOverride w:ilvl="4">
+      <w:startOverride w:val="1"/>
+    </w:lvlOverride>
+    <w:lvlOverride w:ilvl="5">
+      <w:startOverride w:val="1"/>
+    </w:lvlOverride>
+    <w:lvlOverride w:ilvl="6">
+      <w:startOverride w:val="1"/>
+    </w:lvlOverride>
+    <w:lvlOverride w:ilvl="7">
+      <w:startOverride w:val="1"/>
+    </w:lvlOverride>
+    <w:lvlOverride w:ilvl="8">
+      <w:startOverride w:val="1"/>
+    </w:lvlOverride>
+  </w:num>
 </w:numbering>
 </file>
 
 <file path=word/styles.xml><?xml version="1.0" encoding="utf-8"?>
-<w:styles xmlns:mc="http://schemas.openxmlformats.org/markup-compatibility/2006" xmlns:o="urn:schemas-microsoft-com:office:office" xmlns:r="http://schemas.openxmlformats.org/officeDocument/2006/relationships" xmlns:m="http://schemas.openxmlformats.org/officeDocument/2006/math" xmlns:v="urn:schemas-microsoft-com:vml" xmlns:wp="http://schemas.openxmlformats.org/drawingml/2006/wordprocessingDrawing" xmlns:w10="urn:schemas-microsoft-com:office:word" xmlns:w="http://schemas.openxmlformats.org/wordprocessingml/2006/main" xmlns:wne="http://schemas.microsoft.com/office/word/2006/wordml" xmlns:sl="http://schemas.openxmlformats.org/schemaLibrary/2006/main" xmlns:a="http://schemas.openxmlformats.org/drawingml/2006/main" xmlns:pic="http://schemas.openxmlformats.org/drawingml/2006/picture" xmlns:c="http://schemas.openxmlformats.org/drawingml/2006/chart" xmlns:lc="http://schemas.openxmlformats.org/drawingml/2006/lockedCanvas" xmlns:dgm="http://schemas.openxmlformats.org/drawingml/2006/diagram" xmlns:wps="http://schemas.microsoft.com/office/word/2010/wordprocessingShape" xmlns:wpg="http://schemas.microsoft.com/office/word/2010/wordprocessingGroup" xmlns:w14="http://schemas.microsoft.com/office/word/2010/wordml" xmlns:w15="http://schemas.microsoft.com/office/word/2012/wordml" xmlns:w16="http://schemas.microsoft.com/office/word/2018/wordml" xmlns:w16cex="http://schemas.microsoft.com/office/word/2018/wordml/cex" xmlns:w16cid="http://schemas.microsoft.com/office/word/2016/wordml/cid" xmlns="http://schemas.microsoft.com/office/tasks/2019/documenttasks" xmlns:cr="http://schemas.microsoft.com/office/comments/2020/reactions">
+<w:styles xmlns="http://schemas.microsoft.com/office/tasks/2019/documenttasks" xmlns:a="http://schemas.openxmlformats.org/drawingml/2006/main" xmlns:c="http://schemas.openxmlformats.org/drawingml/2006/chart" xmlns:cr="http://schemas.microsoft.com/office/comments/2020/reactions" xmlns:dgm="http://schemas.openxmlformats.org/drawingml/2006/diagram" xmlns:lc="http://schemas.openxmlformats.org/drawingml/2006/lockedCanvas" xmlns:m="http://schemas.openxmlformats.org/officeDocument/2006/math" xmlns:mc="http://schemas.openxmlformats.org/markup-compatibility/2006" xmlns:o="urn:schemas-microsoft-com:office:office" xmlns:pic="http://schemas.openxmlformats.org/drawingml/2006/picture" xmlns:r="http://schemas.openxmlformats.org/officeDocument/2006/relationships" xmlns:sl="http://schemas.openxmlformats.org/schemaLibrary/2006/main" xmlns:v="urn:schemas-microsoft-com:vml" xmlns:w="http://schemas.openxmlformats.org/wordprocessingml/2006/main" xmlns:w10="urn:schemas-microsoft-com:office:word" xmlns:w14="http://schemas.microsoft.com/office/word/2010/wordml" xmlns:w15="http://schemas.microsoft.com/office/word/2012/wordml" xmlns:w16="http://schemas.microsoft.com/office/word/2018/wordml" xmlns:w16cex="http://schemas.microsoft.com/office/word/2018/wordml/cex" xmlns:w16cid="http://schemas.microsoft.com/office/word/2016/wordml/cid" xmlns:wne="http://schemas.microsoft.com/office/word/2006/wordml" xmlns:wp="http://schemas.openxmlformats.org/drawingml/2006/wordprocessingDrawing" xmlns:wpg="http://schemas.microsoft.com/office/word/2010/wordprocessingGroup" xmlns:wps="http://schemas.microsoft.com/office/word/2010/wordprocessingShape">
   <w:docDefaults>
     <w:rPrDefault>
       <w:rPr>
@@ -2031,21 +2628,21 @@
       </w:pPr>
     </w:pPrDefault>
   </w:docDefaults>
-  <w:style w:type="table" w:styleId="TableNormal" w:default="1">
+  <w:style w:default="1" w:styleId="TableNormal" w:type="table">
     <w:name w:val="TableNormal"/>
     <w:tblPr>
       <w:tblCellMar>
-        <w:top w:w="100.0" w:type="dxa"/>
-        <w:left w:w="100.0" w:type="dxa"/>
-        <w:bottom w:w="100.0" w:type="dxa"/>
-        <w:right w:w="100.0" w:type="dxa"/>
+        <w:top w:type="dxa" w:w="100.0"/>
+        <w:left w:type="dxa" w:w="100.0"/>
+        <w:bottom w:type="dxa" w:w="100.0"/>
+        <w:right w:type="dxa" w:w="100.0"/>
       </w:tblCellMar>
     </w:tblPr>
   </w:style>
-  <w:style w:type="paragraph" w:styleId="Normal" w:default="1">
+  <w:style w:default="1" w:styleId="Normal" w:type="paragraph">
     <w:name w:val="normal"/>
   </w:style>
-  <w:style w:type="paragraph" w:styleId="Heading1">
+  <w:style w:styleId="Heading1" w:type="paragraph">
     <w:name w:val="heading 1"/>
     <w:basedOn w:val="Normal"/>
     <w:next w:val="Normal"/>
@@ -2060,7 +2657,7 @@
       <w:szCs w:val="40"/>
     </w:rPr>
   </w:style>
-  <w:style w:type="paragraph" w:styleId="Heading2">
+  <w:style w:styleId="Heading2" w:type="paragraph">
     <w:name w:val="heading 2"/>
     <w:basedOn w:val="Normal"/>
     <w:next w:val="Normal"/>
@@ -2077,7 +2674,7 @@
       <w:szCs w:val="32"/>
     </w:rPr>
   </w:style>
-  <w:style w:type="paragraph" w:styleId="Heading3">
+  <w:style w:styleId="Heading3" w:type="paragraph">
     <w:name w:val="heading 3"/>
     <w:basedOn w:val="Normal"/>
     <w:next w:val="Normal"/>
@@ -2095,7 +2692,7 @@
       <w:szCs w:val="28"/>
     </w:rPr>
   </w:style>
-  <w:style w:type="paragraph" w:styleId="Heading4">
+  <w:style w:styleId="Heading4" w:type="paragraph">
     <w:name w:val="heading 4"/>
     <w:basedOn w:val="Normal"/>
     <w:next w:val="Normal"/>
@@ -2111,7 +2708,7 @@
       <w:szCs w:val="24"/>
     </w:rPr>
   </w:style>
-  <w:style w:type="paragraph" w:styleId="Heading5">
+  <w:style w:styleId="Heading5" w:type="paragraph">
     <w:name w:val="heading 5"/>
     <w:basedOn w:val="Normal"/>
     <w:next w:val="Normal"/>
@@ -2127,7 +2724,7 @@
       <w:szCs w:val="22"/>
     </w:rPr>
   </w:style>
-  <w:style w:type="paragraph" w:styleId="Heading6">
+  <w:style w:styleId="Heading6" w:type="paragraph">
     <w:name w:val="heading 6"/>
     <w:basedOn w:val="Normal"/>
     <w:next w:val="Normal"/>
@@ -2145,7 +2742,7 @@
       <w:szCs w:val="22"/>
     </w:rPr>
   </w:style>
-  <w:style w:type="paragraph" w:styleId="Title">
+  <w:style w:styleId="Title" w:type="paragraph">
     <w:name w:val="Title"/>
     <w:basedOn w:val="Normal"/>
     <w:next w:val="Normal"/>
@@ -2160,7 +2757,7 @@
       <w:szCs w:val="52"/>
     </w:rPr>
   </w:style>
-  <w:style w:type="paragraph" w:styleId="Subtitle">
+  <w:style w:styleId="Subtitle" w:type="paragraph">
     <w:name w:val="Subtitle"/>
     <w:basedOn w:val="Normal"/>
     <w:next w:val="Normal"/>
@@ -2179,7 +2776,7 @@
       <w:szCs w:val="30"/>
     </w:rPr>
   </w:style>
-  <w:style w:type="table" w:styleId="Table1">
+  <w:style w:styleId="Table1" w:type="table">
     <w:basedOn w:val="TableNormal"/>
     <w:tblPr>
       <w:tblStyleRowBandSize w:val="1"/>
@@ -2187,7 +2784,7 @@
       <w:tblCellMar/>
     </w:tblPr>
   </w:style>
-  <w:style w:type="table" w:styleId="Table2">
+  <w:style w:styleId="Table2" w:type="table">
     <w:basedOn w:val="TableNormal"/>
     <w:tblPr>
       <w:tblStyleRowBandSize w:val="1"/>
@@ -2195,7 +2792,7 @@
       <w:tblCellMar/>
     </w:tblPr>
   </w:style>
-  <w:style w:type="table" w:styleId="Table3">
+  <w:style w:styleId="Table3" w:type="table">
     <w:basedOn w:val="TableNormal"/>
     <w:tblPr>
       <w:tblStyleRowBandSize w:val="1"/>
@@ -2203,7 +2800,7 @@
       <w:tblCellMar/>
     </w:tblPr>
   </w:style>
-  <w:style w:type="table" w:styleId="Table4">
+  <w:style w:styleId="Table4" w:type="table">
     <w:basedOn w:val="TableNormal"/>
     <w:tblPr>
       <w:tblStyleRowBandSize w:val="1"/>
@@ -2211,13 +2808,247 @@
       <w:tblCellMar/>
     </w:tblPr>
   </w:style>
-  <w:style w:type="table" w:styleId="Table5">
+  <w:style w:styleId="Table5" w:type="table">
     <w:basedOn w:val="TableNormal"/>
     <w:tblPr>
       <w:tblStyleRowBandSize w:val="1"/>
       <w:tblStyleColBandSize w:val="1"/>
       <w:tblCellMar/>
     </w:tblPr>
+  </w:style>
+  <w:style w:type="paragraph" w:customStyle="1" w:styleId="SourceCode">
+    <w:name w:val="Source Code"/>
+    <w:basedOn w:val="Normal"/>
+    <w:link w:val="VerbatimChar"/>
+    <w:pPr>
+      <w:wordWrap w:val="off"/>
+    </w:pPr>
+  </w:style>
+  <w:style w:type="character" w:customStyle="1" w:styleId="KeywordTok">
+    <w:name w:val="KeywordTok"/>
+    <w:basedOn w:val="VerbatimChar"/>
+    <w:rPr>
+      <w:b/>
+      <w:color w:val="007020"/>
+    </w:rPr>
+  </w:style>
+  <w:style w:type="character" w:customStyle="1" w:styleId="DataTypeTok">
+    <w:name w:val="DataTypeTok"/>
+    <w:basedOn w:val="VerbatimChar"/>
+    <w:rPr>
+      <w:color w:val="902000"/>
+    </w:rPr>
+  </w:style>
+  <w:style w:type="character" w:customStyle="1" w:styleId="DecValTok">
+    <w:name w:val="DecValTok"/>
+    <w:basedOn w:val="VerbatimChar"/>
+    <w:rPr>
+      <w:color w:val="40a070"/>
+    </w:rPr>
+  </w:style>
+  <w:style w:type="character" w:customStyle="1" w:styleId="BaseNTok">
+    <w:name w:val="BaseNTok"/>
+    <w:basedOn w:val="VerbatimChar"/>
+    <w:rPr>
+      <w:color w:val="40a070"/>
+    </w:rPr>
+  </w:style>
+  <w:style w:type="character" w:customStyle="1" w:styleId="FloatTok">
+    <w:name w:val="FloatTok"/>
+    <w:basedOn w:val="VerbatimChar"/>
+    <w:rPr>
+      <w:color w:val="40a070"/>
+    </w:rPr>
+  </w:style>
+  <w:style w:type="character" w:customStyle="1" w:styleId="ConstantTok">
+    <w:name w:val="ConstantTok"/>
+    <w:basedOn w:val="VerbatimChar"/>
+    <w:rPr>
+      <w:color w:val="880000"/>
+    </w:rPr>
+  </w:style>
+  <w:style w:type="character" w:customStyle="1" w:styleId="CharTok">
+    <w:name w:val="CharTok"/>
+    <w:basedOn w:val="VerbatimChar"/>
+    <w:rPr>
+      <w:color w:val="4070a0"/>
+    </w:rPr>
+  </w:style>
+  <w:style w:type="character" w:customStyle="1" w:styleId="SpecialCharTok">
+    <w:name w:val="SpecialCharTok"/>
+    <w:basedOn w:val="VerbatimChar"/>
+    <w:rPr>
+      <w:color w:val="4070a0"/>
+    </w:rPr>
+  </w:style>
+  <w:style w:type="character" w:customStyle="1" w:styleId="StringTok">
+    <w:name w:val="StringTok"/>
+    <w:basedOn w:val="VerbatimChar"/>
+    <w:rPr>
+      <w:color w:val="4070a0"/>
+    </w:rPr>
+  </w:style>
+  <w:style w:type="character" w:customStyle="1" w:styleId="VerbatimStringTok">
+    <w:name w:val="VerbatimStringTok"/>
+    <w:basedOn w:val="VerbatimChar"/>
+    <w:rPr>
+      <w:color w:val="4070a0"/>
+    </w:rPr>
+  </w:style>
+  <w:style w:type="character" w:customStyle="1" w:styleId="SpecialStringTok">
+    <w:name w:val="SpecialStringTok"/>
+    <w:basedOn w:val="VerbatimChar"/>
+    <w:rPr>
+      <w:color w:val="bb6688"/>
+    </w:rPr>
+  </w:style>
+  <w:style w:type="character" w:customStyle="1" w:styleId="ImportTok">
+    <w:name w:val="ImportTok"/>
+    <w:basedOn w:val="VerbatimChar"/>
+    <w:rPr>
+      <w:b/>
+      <w:color w:val="008000"/>
+    </w:rPr>
+  </w:style>
+  <w:style w:type="character" w:customStyle="1" w:styleId="CommentTok">
+    <w:name w:val="CommentTok"/>
+    <w:basedOn w:val="VerbatimChar"/>
+    <w:rPr>
+      <w:i/>
+      <w:color w:val="60a0b0"/>
+    </w:rPr>
+  </w:style>
+  <w:style w:type="character" w:customStyle="1" w:styleId="DocumentationTok">
+    <w:name w:val="DocumentationTok"/>
+    <w:basedOn w:val="VerbatimChar"/>
+    <w:rPr>
+      <w:i/>
+      <w:color w:val="ba2121"/>
+    </w:rPr>
+  </w:style>
+  <w:style w:type="character" w:customStyle="1" w:styleId="AnnotationTok">
+    <w:name w:val="AnnotationTok"/>
+    <w:basedOn w:val="VerbatimChar"/>
+    <w:rPr>
+      <w:b/>
+      <w:i/>
+      <w:color w:val="60a0b0"/>
+    </w:rPr>
+  </w:style>
+  <w:style w:type="character" w:customStyle="1" w:styleId="CommentVarTok">
+    <w:name w:val="CommentVarTok"/>
+    <w:basedOn w:val="VerbatimChar"/>
+    <w:rPr>
+      <w:b/>
+      <w:i/>
+      <w:color w:val="60a0b0"/>
+    </w:rPr>
+  </w:style>
+  <w:style w:type="character" w:customStyle="1" w:styleId="OtherTok">
+    <w:name w:val="OtherTok"/>
+    <w:basedOn w:val="VerbatimChar"/>
+    <w:rPr>
+      <w:color w:val="007020"/>
+    </w:rPr>
+  </w:style>
+  <w:style w:type="character" w:customStyle="1" w:styleId="FunctionTok">
+    <w:name w:val="FunctionTok"/>
+    <w:basedOn w:val="VerbatimChar"/>
+    <w:rPr>
+      <w:color w:val="06287e"/>
+    </w:rPr>
+  </w:style>
+  <w:style w:type="character" w:customStyle="1" w:styleId="VariableTok">
+    <w:name w:val="VariableTok"/>
+    <w:basedOn w:val="VerbatimChar"/>
+    <w:rPr>
+      <w:color w:val="19177c"/>
+    </w:rPr>
+  </w:style>
+  <w:style w:type="character" w:customStyle="1" w:styleId="ControlFlowTok">
+    <w:name w:val="ControlFlowTok"/>
+    <w:basedOn w:val="VerbatimChar"/>
+    <w:rPr>
+      <w:b/>
+      <w:color w:val="007020"/>
+    </w:rPr>
+  </w:style>
+  <w:style w:type="character" w:customStyle="1" w:styleId="OperatorTok">
+    <w:name w:val="OperatorTok"/>
+    <w:basedOn w:val="VerbatimChar"/>
+    <w:rPr>
+      <w:color w:val="666666"/>
+    </w:rPr>
+  </w:style>
+  <w:style w:type="character" w:customStyle="1" w:styleId="BuiltInTok">
+    <w:name w:val="BuiltInTok"/>
+    <w:basedOn w:val="VerbatimChar"/>
+    <w:rPr>
+      <w:color w:val="008000"/>
+    </w:rPr>
+  </w:style>
+  <w:style w:type="character" w:customStyle="1" w:styleId="ExtensionTok">
+    <w:name w:val="ExtensionTok"/>
+    <w:basedOn w:val="VerbatimChar"/>
+    <w:rPr/>
+  </w:style>
+  <w:style w:type="character" w:customStyle="1" w:styleId="PreprocessorTok">
+    <w:name w:val="PreprocessorTok"/>
+    <w:basedOn w:val="VerbatimChar"/>
+    <w:rPr>
+      <w:color w:val="bc7a00"/>
+    </w:rPr>
+  </w:style>
+  <w:style w:type="character" w:customStyle="1" w:styleId="AttributeTok">
+    <w:name w:val="AttributeTok"/>
+    <w:basedOn w:val="VerbatimChar"/>
+    <w:rPr>
+      <w:color w:val="7d9029"/>
+    </w:rPr>
+  </w:style>
+  <w:style w:type="character" w:customStyle="1" w:styleId="RegionMarkerTok">
+    <w:name w:val="RegionMarkerTok"/>
+    <w:basedOn w:val="VerbatimChar"/>
+    <w:rPr/>
+  </w:style>
+  <w:style w:type="character" w:customStyle="1" w:styleId="InformationTok">
+    <w:name w:val="InformationTok"/>
+    <w:basedOn w:val="VerbatimChar"/>
+    <w:rPr>
+      <w:b/>
+      <w:i/>
+      <w:color w:val="60a0b0"/>
+    </w:rPr>
+  </w:style>
+  <w:style w:type="character" w:customStyle="1" w:styleId="WarningTok">
+    <w:name w:val="WarningTok"/>
+    <w:basedOn w:val="VerbatimChar"/>
+    <w:rPr>
+      <w:b/>
+      <w:i/>
+      <w:color w:val="60a0b0"/>
+    </w:rPr>
+  </w:style>
+  <w:style w:type="character" w:customStyle="1" w:styleId="AlertTok">
+    <w:name w:val="AlertTok"/>
+    <w:basedOn w:val="VerbatimChar"/>
+    <w:rPr>
+      <w:b/>
+      <w:color w:val="ff0000"/>
+    </w:rPr>
+  </w:style>
+  <w:style w:type="character" w:customStyle="1" w:styleId="ErrorTok">
+    <w:name w:val="ErrorTok"/>
+    <w:basedOn w:val="VerbatimChar"/>
+    <w:rPr>
+      <w:b/>
+      <w:color w:val="ff0000"/>
+    </w:rPr>
+  </w:style>
+  <w:style w:type="character" w:customStyle="1" w:styleId="NormalTok">
+    <w:name w:val="NormalTok"/>
+    <w:basedOn w:val="VerbatimChar"/>
+    <w:rPr/>
   </w:style>
 </w:styles>
 </file>

</xml_diff>